<commit_message>
chore: update documentation, docker and gitignore configurations
</commit_message>
<xml_diff>
--- a/CodeNight.docx
+++ b/CodeNight.docx
@@ -37,7 +37,55 @@
         <w:t>0.1</w:t>
       </w:r>
       <w:r>
-        <w:t xml:space="preserve"> Android projesi kurulumu (Gradle, Jetpack Compose, Hilt/Koin)</w:t>
+        <w:t xml:space="preserve"> </w:t>
+      </w:r>
+      <w:proofErr w:type="spellStart"/>
+      <w:r>
+        <w:t>Android</w:t>
+      </w:r>
+      <w:proofErr w:type="spellEnd"/>
+      <w:r>
+        <w:t xml:space="preserve"> projesi kurulumu (</w:t>
+      </w:r>
+      <w:proofErr w:type="spellStart"/>
+      <w:r>
+        <w:t>Gradle</w:t>
+      </w:r>
+      <w:proofErr w:type="spellEnd"/>
+      <w:r>
+        <w:t xml:space="preserve">, </w:t>
+      </w:r>
+      <w:proofErr w:type="spellStart"/>
+      <w:r>
+        <w:t>Jetpack</w:t>
+      </w:r>
+      <w:proofErr w:type="spellEnd"/>
+      <w:r>
+        <w:t xml:space="preserve"> </w:t>
+      </w:r>
+      <w:proofErr w:type="spellStart"/>
+      <w:r>
+        <w:t>Compose</w:t>
+      </w:r>
+      <w:proofErr w:type="spellEnd"/>
+      <w:r>
+        <w:t xml:space="preserve">, </w:t>
+      </w:r>
+      <w:proofErr w:type="spellStart"/>
+      <w:r>
+        <w:t>Hilt</w:t>
+      </w:r>
+      <w:proofErr w:type="spellEnd"/>
+      <w:r>
+        <w:t>/</w:t>
+      </w:r>
+      <w:proofErr w:type="spellStart"/>
+      <w:r>
+        <w:t>Koin</w:t>
+      </w:r>
+      <w:proofErr w:type="spellEnd"/>
+      <w:r>
+        <w:t>)</w:t>
       </w:r>
       <w:r>
         <w:t xml:space="preserve">  </w:t>
@@ -58,7 +106,39 @@
         <w:t>0.2</w:t>
       </w:r>
       <w:r>
-        <w:t xml:space="preserve"> FastAPI proje iskeleti, Docker Compose ile PostgreSQL+Redis ayağa kaldırma</w:t>
+        <w:t xml:space="preserve"> </w:t>
+      </w:r>
+      <w:proofErr w:type="spellStart"/>
+      <w:r>
+        <w:t>FastAPI</w:t>
+      </w:r>
+      <w:proofErr w:type="spellEnd"/>
+      <w:r>
+        <w:t xml:space="preserve"> proje iskeleti, </w:t>
+      </w:r>
+      <w:proofErr w:type="spellStart"/>
+      <w:r>
+        <w:t>Docker</w:t>
+      </w:r>
+      <w:proofErr w:type="spellEnd"/>
+      <w:r>
+        <w:t xml:space="preserve"> </w:t>
+      </w:r>
+      <w:proofErr w:type="spellStart"/>
+      <w:r>
+        <w:t>Compose</w:t>
+      </w:r>
+      <w:proofErr w:type="spellEnd"/>
+      <w:r>
+        <w:t xml:space="preserve"> ile </w:t>
+      </w:r>
+      <w:proofErr w:type="spellStart"/>
+      <w:r>
+        <w:t>PostgreSQL+Redis</w:t>
+      </w:r>
+      <w:proofErr w:type="spellEnd"/>
+      <w:r>
+        <w:t xml:space="preserve"> ayağa kaldırma</w:t>
       </w:r>
     </w:p>
     <w:p>
@@ -76,7 +156,31 @@
         <w:t>0.3</w:t>
       </w:r>
       <w:r>
-        <w:t xml:space="preserve"> Veritabanı migrasyon aracı (Alembic) konfigürasyonu</w:t>
+        <w:t xml:space="preserve"> </w:t>
+      </w:r>
+      <w:proofErr w:type="spellStart"/>
+      <w:r>
+        <w:t>Veritabanı</w:t>
+      </w:r>
+      <w:proofErr w:type="spellEnd"/>
+      <w:r>
+        <w:t xml:space="preserve"> </w:t>
+      </w:r>
+      <w:proofErr w:type="spellStart"/>
+      <w:r>
+        <w:t>migrasyon</w:t>
+      </w:r>
+      <w:proofErr w:type="spellEnd"/>
+      <w:r>
+        <w:t xml:space="preserve"> aracı (</w:t>
+      </w:r>
+      <w:proofErr w:type="spellStart"/>
+      <w:r>
+        <w:t>Alembic</w:t>
+      </w:r>
+      <w:proofErr w:type="spellEnd"/>
+      <w:r>
+        <w:t>) konfigürasyonu</w:t>
       </w:r>
     </w:p>
     <w:p>
@@ -94,7 +198,23 @@
         <w:t>0.4</w:t>
       </w:r>
       <w:r>
-        <w:t xml:space="preserve"> Ortak API kontratları için Swagger/OpenAPI şablonu</w:t>
+        <w:t xml:space="preserve"> Ortak API kontratları için </w:t>
+      </w:r>
+      <w:proofErr w:type="spellStart"/>
+      <w:r>
+        <w:t>Swagger</w:t>
+      </w:r>
+      <w:proofErr w:type="spellEnd"/>
+      <w:r>
+        <w:t>/</w:t>
+      </w:r>
+      <w:proofErr w:type="spellStart"/>
+      <w:r>
+        <w:t>OpenAPI</w:t>
+      </w:r>
+      <w:proofErr w:type="spellEnd"/>
+      <w:r>
+        <w:t xml:space="preserve"> şablonu</w:t>
       </w:r>
     </w:p>
     <w:p>
@@ -107,7 +227,15 @@
         <w:pStyle w:val="Balk3"/>
       </w:pPr>
       <w:r>
-        <w:t>FAZ 1: Veritabanı Tasarımı ve Temel Altyapı</w:t>
+        <w:t xml:space="preserve">FAZ 1: </w:t>
+      </w:r>
+      <w:proofErr w:type="spellStart"/>
+      <w:r>
+        <w:t>Veritabanı</w:t>
+      </w:r>
+      <w:proofErr w:type="spellEnd"/>
+      <w:r>
+        <w:t xml:space="preserve"> Tasarımı ve Temel Altyapı</w:t>
       </w:r>
     </w:p>
     <w:tbl>
@@ -226,8 +354,13 @@
             <w:pPr>
               <w:pStyle w:val="TableContents"/>
             </w:pPr>
-            <w:r>
-              <w:t xml:space="preserve">PostgreSQL şeması: kullanıcı, metrikler, hedefler, bildirimler, skorlar, </w:t>
+            <w:proofErr w:type="spellStart"/>
+            <w:r>
+              <w:t>PostgreSQL</w:t>
+            </w:r>
+            <w:proofErr w:type="spellEnd"/>
+            <w:r>
+              <w:t xml:space="preserve"> şeması: kullanıcı, metrikler, hedefler, bildirimler, skorlar, </w:t>
             </w:r>
             <w:r>
               <w:rPr>
@@ -273,9 +406,11 @@
             <w:pPr>
               <w:pStyle w:val="TableContents"/>
             </w:pPr>
+            <w:proofErr w:type="spellStart"/>
             <w:r>
               <w:t>Veritabanı</w:t>
             </w:r>
+            <w:proofErr w:type="spellEnd"/>
           </w:p>
         </w:tc>
       </w:tr>
@@ -315,8 +450,29 @@
             <w:pPr>
               <w:pStyle w:val="TableContents"/>
             </w:pPr>
-            <w:r>
-              <w:t>TimescaleDB hypertable veya partitioning (metrikler için)</w:t>
+            <w:proofErr w:type="spellStart"/>
+            <w:r>
+              <w:t>TimescaleDB</w:t>
+            </w:r>
+            <w:proofErr w:type="spellEnd"/>
+            <w:r>
+              <w:t xml:space="preserve"> </w:t>
+            </w:r>
+            <w:proofErr w:type="spellStart"/>
+            <w:r>
+              <w:t>hypertable</w:t>
+            </w:r>
+            <w:proofErr w:type="spellEnd"/>
+            <w:r>
+              <w:t xml:space="preserve"> veya </w:t>
+            </w:r>
+            <w:proofErr w:type="spellStart"/>
+            <w:r>
+              <w:t>partitioning</w:t>
+            </w:r>
+            <w:proofErr w:type="spellEnd"/>
+            <w:r>
+              <w:t xml:space="preserve"> (metrikler için)</w:t>
             </w:r>
           </w:p>
         </w:tc>
@@ -335,9 +491,11 @@
             <w:pPr>
               <w:pStyle w:val="TableContents"/>
             </w:pPr>
+            <w:proofErr w:type="spellStart"/>
             <w:r>
               <w:t>Veritabanı</w:t>
             </w:r>
+            <w:proofErr w:type="spellEnd"/>
           </w:p>
         </w:tc>
       </w:tr>
@@ -378,7 +536,15 @@
               <w:pStyle w:val="TableContents"/>
             </w:pPr>
             <w:r>
-              <w:t>İndeksleme (kullanıcı+tarih, arkadaş aramaları)</w:t>
+              <w:t>İndeksleme (</w:t>
+            </w:r>
+            <w:proofErr w:type="spellStart"/>
+            <w:r>
+              <w:t>kullanıcı+tarih</w:t>
+            </w:r>
+            <w:proofErr w:type="spellEnd"/>
+            <w:r>
+              <w:t>, arkadaş aramaları)</w:t>
             </w:r>
           </w:p>
         </w:tc>
@@ -397,9 +563,11 @@
             <w:pPr>
               <w:pStyle w:val="TableContents"/>
             </w:pPr>
+            <w:proofErr w:type="spellStart"/>
             <w:r>
               <w:t>Veritabanı</w:t>
             </w:r>
+            <w:proofErr w:type="spellEnd"/>
           </w:p>
         </w:tc>
       </w:tr>
@@ -440,7 +608,15 @@
               <w:pStyle w:val="TableContents"/>
             </w:pPr>
             <w:r>
-              <w:t>Migration dosyaları ve seed data (test kullanıcıları, rozet tanımları)</w:t>
+              <w:t xml:space="preserve">Migration dosyaları ve </w:t>
+            </w:r>
+            <w:proofErr w:type="spellStart"/>
+            <w:r>
+              <w:t>seed</w:t>
+            </w:r>
+            <w:proofErr w:type="spellEnd"/>
+            <w:r>
+              <w:t xml:space="preserve"> data (test kullanıcıları, rozet tanımları)</w:t>
             </w:r>
           </w:p>
         </w:tc>
@@ -459,9 +635,11 @@
             <w:pPr>
               <w:pStyle w:val="TableContents"/>
             </w:pPr>
+            <w:proofErr w:type="spellStart"/>
             <w:r>
               <w:t>Veritabanı</w:t>
             </w:r>
+            <w:proofErr w:type="spellEnd"/>
           </w:p>
         </w:tc>
       </w:tr>
@@ -510,23 +688,83 @@
             <w:r>
               <w:t>: Rozet tanımları tablosu (</w:t>
             </w:r>
+            <w:proofErr w:type="spellStart"/>
             <w:r>
               <w:rPr>
                 <w:rStyle w:val="SourceText"/>
               </w:rPr>
               <w:t>badges</w:t>
             </w:r>
-            <w:r>
-              <w:t>: id, name, description, criteria, icon) ve kullanıcı rozetleri (</w:t>
-            </w:r>
+            <w:proofErr w:type="spellEnd"/>
+            <w:r>
+              <w:t xml:space="preserve">: </w:t>
+            </w:r>
+            <w:proofErr w:type="spellStart"/>
+            <w:r>
+              <w:t>id</w:t>
+            </w:r>
+            <w:proofErr w:type="spellEnd"/>
+            <w:r>
+              <w:t xml:space="preserve">, name, </w:t>
+            </w:r>
+            <w:proofErr w:type="spellStart"/>
+            <w:r>
+              <w:t>description</w:t>
+            </w:r>
+            <w:proofErr w:type="spellEnd"/>
+            <w:r>
+              <w:t xml:space="preserve">, </w:t>
+            </w:r>
+            <w:proofErr w:type="spellStart"/>
+            <w:r>
+              <w:t>criteria</w:t>
+            </w:r>
+            <w:proofErr w:type="spellEnd"/>
+            <w:r>
+              <w:t xml:space="preserve">, </w:t>
+            </w:r>
+            <w:proofErr w:type="spellStart"/>
+            <w:r>
+              <w:t>icon</w:t>
+            </w:r>
+            <w:proofErr w:type="spellEnd"/>
+            <w:r>
+              <w:t>) ve kullanıcı rozetleri (</w:t>
+            </w:r>
+            <w:proofErr w:type="spellStart"/>
             <w:r>
               <w:rPr>
                 <w:rStyle w:val="SourceText"/>
               </w:rPr>
               <w:t>user_badges</w:t>
             </w:r>
-            <w:r>
-              <w:t>: user_id, badge_id, earned_at)</w:t>
+            <w:proofErr w:type="spellEnd"/>
+            <w:r>
+              <w:t xml:space="preserve">: </w:t>
+            </w:r>
+            <w:proofErr w:type="spellStart"/>
+            <w:r>
+              <w:t>user_id</w:t>
+            </w:r>
+            <w:proofErr w:type="spellEnd"/>
+            <w:r>
+              <w:t xml:space="preserve">, </w:t>
+            </w:r>
+            <w:proofErr w:type="spellStart"/>
+            <w:r>
+              <w:t>badge_id</w:t>
+            </w:r>
+            <w:proofErr w:type="spellEnd"/>
+            <w:r>
+              <w:t xml:space="preserve">, </w:t>
+            </w:r>
+            <w:proofErr w:type="spellStart"/>
+            <w:r>
+              <w:t>earned_at</w:t>
+            </w:r>
+            <w:proofErr w:type="spellEnd"/>
+            <w:r>
+              <w:t>)</w:t>
             </w:r>
           </w:p>
         </w:tc>
@@ -545,9 +783,11 @@
             <w:pPr>
               <w:pStyle w:val="TableContents"/>
             </w:pPr>
+            <w:proofErr w:type="spellStart"/>
             <w:r>
               <w:t>Veritabanı</w:t>
             </w:r>
+            <w:proofErr w:type="spellEnd"/>
           </w:p>
         </w:tc>
       </w:tr>
@@ -596,14 +836,48 @@
             <w:r>
               <w:t>: Arkadaşlık tablosu (</w:t>
             </w:r>
+            <w:proofErr w:type="spellStart"/>
             <w:r>
               <w:rPr>
                 <w:rStyle w:val="SourceText"/>
               </w:rPr>
               <w:t>friendships</w:t>
             </w:r>
-            <w:r>
-              <w:t>: user_id, friend_id, status, created_at)</w:t>
+            <w:proofErr w:type="spellEnd"/>
+            <w:r>
+              <w:t xml:space="preserve">: </w:t>
+            </w:r>
+            <w:proofErr w:type="spellStart"/>
+            <w:r>
+              <w:t>user_id</w:t>
+            </w:r>
+            <w:proofErr w:type="spellEnd"/>
+            <w:r>
+              <w:t xml:space="preserve">, </w:t>
+            </w:r>
+            <w:proofErr w:type="spellStart"/>
+            <w:r>
+              <w:t>friend_id</w:t>
+            </w:r>
+            <w:proofErr w:type="spellEnd"/>
+            <w:r>
+              <w:t xml:space="preserve">, </w:t>
+            </w:r>
+            <w:proofErr w:type="spellStart"/>
+            <w:r>
+              <w:t>status</w:t>
+            </w:r>
+            <w:proofErr w:type="spellEnd"/>
+            <w:r>
+              <w:t xml:space="preserve">, </w:t>
+            </w:r>
+            <w:proofErr w:type="spellStart"/>
+            <w:r>
+              <w:t>created_at</w:t>
+            </w:r>
+            <w:proofErr w:type="spellEnd"/>
+            <w:r>
+              <w:t>)</w:t>
             </w:r>
           </w:p>
         </w:tc>
@@ -622,9 +896,11 @@
             <w:pPr>
               <w:pStyle w:val="TableContents"/>
             </w:pPr>
+            <w:proofErr w:type="spellStart"/>
             <w:r>
               <w:t>Veritabanı</w:t>
             </w:r>
+            <w:proofErr w:type="spellEnd"/>
           </w:p>
         </w:tc>
       </w:tr>
@@ -673,14 +949,64 @@
             <w:r>
               <w:t>: Ödeme geçmişi tablosu (</w:t>
             </w:r>
+            <w:proofErr w:type="spellStart"/>
             <w:r>
               <w:rPr>
                 <w:rStyle w:val="SourceText"/>
               </w:rPr>
               <w:t>payment_history</w:t>
             </w:r>
-            <w:r>
-              <w:t>: user_id, amount, currency, status, payment_method, created_at)</w:t>
+            <w:proofErr w:type="spellEnd"/>
+            <w:r>
+              <w:t xml:space="preserve">: </w:t>
+            </w:r>
+            <w:proofErr w:type="spellStart"/>
+            <w:r>
+              <w:t>user_id</w:t>
+            </w:r>
+            <w:proofErr w:type="spellEnd"/>
+            <w:r>
+              <w:t xml:space="preserve">, </w:t>
+            </w:r>
+            <w:proofErr w:type="spellStart"/>
+            <w:r>
+              <w:t>amount</w:t>
+            </w:r>
+            <w:proofErr w:type="spellEnd"/>
+            <w:r>
+              <w:t xml:space="preserve">, </w:t>
+            </w:r>
+            <w:proofErr w:type="spellStart"/>
+            <w:r>
+              <w:t>currency</w:t>
+            </w:r>
+            <w:proofErr w:type="spellEnd"/>
+            <w:r>
+              <w:t xml:space="preserve">, </w:t>
+            </w:r>
+            <w:proofErr w:type="spellStart"/>
+            <w:r>
+              <w:t>status</w:t>
+            </w:r>
+            <w:proofErr w:type="spellEnd"/>
+            <w:r>
+              <w:t xml:space="preserve">, </w:t>
+            </w:r>
+            <w:proofErr w:type="spellStart"/>
+            <w:r>
+              <w:t>payment_method</w:t>
+            </w:r>
+            <w:proofErr w:type="spellEnd"/>
+            <w:r>
+              <w:t xml:space="preserve">, </w:t>
+            </w:r>
+            <w:proofErr w:type="spellStart"/>
+            <w:r>
+              <w:t>created_at</w:t>
+            </w:r>
+            <w:proofErr w:type="spellEnd"/>
+            <w:r>
+              <w:t>)</w:t>
             </w:r>
           </w:p>
         </w:tc>
@@ -699,9 +1025,11 @@
             <w:pPr>
               <w:pStyle w:val="TableContents"/>
             </w:pPr>
+            <w:proofErr w:type="spellStart"/>
             <w:r>
               <w:t>Veritabanı</w:t>
             </w:r>
+            <w:proofErr w:type="spellEnd"/>
           </w:p>
         </w:tc>
       </w:tr>
@@ -741,8 +1069,29 @@
             <w:pPr>
               <w:pStyle w:val="TableContents"/>
             </w:pPr>
-            <w:r>
-              <w:t>Swagger/OpenAPI şablonu oluşturma (ilk endpoint listesi)</w:t>
+            <w:proofErr w:type="spellStart"/>
+            <w:r>
+              <w:t>Swagger</w:t>
+            </w:r>
+            <w:proofErr w:type="spellEnd"/>
+            <w:r>
+              <w:t>/</w:t>
+            </w:r>
+            <w:proofErr w:type="spellStart"/>
+            <w:r>
+              <w:t>OpenAPI</w:t>
+            </w:r>
+            <w:proofErr w:type="spellEnd"/>
+            <w:r>
+              <w:t xml:space="preserve"> şablonu oluşturma (ilk </w:t>
+            </w:r>
+            <w:proofErr w:type="spellStart"/>
+            <w:r>
+              <w:t>endpoint</w:t>
+            </w:r>
+            <w:proofErr w:type="spellEnd"/>
+            <w:r>
+              <w:t xml:space="preserve"> listesi)</w:t>
             </w:r>
           </w:p>
         </w:tc>
@@ -761,9 +1110,11 @@
             <w:pPr>
               <w:pStyle w:val="TableContents"/>
             </w:pPr>
+            <w:proofErr w:type="spellStart"/>
             <w:r>
               <w:t>Backend</w:t>
             </w:r>
+            <w:proofErr w:type="spellEnd"/>
           </w:p>
         </w:tc>
       </w:tr>
@@ -803,8 +1154,45 @@
             <w:pPr>
               <w:pStyle w:val="TableContents"/>
             </w:pPr>
-            <w:r>
-              <w:t>Android mock API sunucusu (OkHttp interceptor ile mock yanıtlar)</w:t>
+            <w:proofErr w:type="spellStart"/>
+            <w:r>
+              <w:t>Android</w:t>
+            </w:r>
+            <w:proofErr w:type="spellEnd"/>
+            <w:r>
+              <w:t xml:space="preserve"> </w:t>
+            </w:r>
+            <w:proofErr w:type="spellStart"/>
+            <w:r>
+              <w:t>mock</w:t>
+            </w:r>
+            <w:proofErr w:type="spellEnd"/>
+            <w:r>
+              <w:t xml:space="preserve"> API sunucusu (</w:t>
+            </w:r>
+            <w:proofErr w:type="spellStart"/>
+            <w:r>
+              <w:t>OkHttp</w:t>
+            </w:r>
+            <w:proofErr w:type="spellEnd"/>
+            <w:r>
+              <w:t xml:space="preserve"> </w:t>
+            </w:r>
+            <w:proofErr w:type="spellStart"/>
+            <w:r>
+              <w:t>interceptor</w:t>
+            </w:r>
+            <w:proofErr w:type="spellEnd"/>
+            <w:r>
+              <w:t xml:space="preserve"> ile </w:t>
+            </w:r>
+            <w:proofErr w:type="spellStart"/>
+            <w:r>
+              <w:t>mock</w:t>
+            </w:r>
+            <w:proofErr w:type="spellEnd"/>
+            <w:r>
+              <w:t xml:space="preserve"> yanıtlar)</w:t>
             </w:r>
           </w:p>
         </w:tc>
@@ -823,9 +1211,11 @@
             <w:pPr>
               <w:pStyle w:val="TableContents"/>
             </w:pPr>
+            <w:proofErr w:type="spellStart"/>
             <w:r>
               <w:t>Android</w:t>
             </w:r>
+            <w:proofErr w:type="spellEnd"/>
           </w:p>
         </w:tc>
       </w:tr>
@@ -959,9 +1349,19 @@
             <w:pPr>
               <w:pStyle w:val="TableContents"/>
             </w:pPr>
-            <w:r>
-              <w:t>FastAPI'de OTP servisi (simülasyon: 1234), rate limiting</w:t>
-            </w:r>
+            <w:proofErr w:type="spellStart"/>
+            <w:r>
+              <w:t>FastAPI'de</w:t>
+            </w:r>
+            <w:proofErr w:type="spellEnd"/>
+            <w:r>
+              <w:t xml:space="preserve"> OTP servisi (simülasyon: 1234), rate </w:t>
+            </w:r>
+            <w:proofErr w:type="spellStart"/>
+            <w:r>
+              <w:t>limiting</w:t>
+            </w:r>
+            <w:proofErr w:type="spellEnd"/>
           </w:p>
         </w:tc>
         <w:tc>
@@ -979,9 +1379,11 @@
             <w:pPr>
               <w:pStyle w:val="TableContents"/>
             </w:pPr>
+            <w:proofErr w:type="spellStart"/>
             <w:r>
               <w:t>Backend</w:t>
             </w:r>
+            <w:proofErr w:type="spellEnd"/>
           </w:p>
         </w:tc>
       </w:tr>
@@ -1022,8 +1424,21 @@
               <w:pStyle w:val="TableContents"/>
             </w:pPr>
             <w:r>
-              <w:t>JWT oluşturma (python-jose) ve doğrulama middleware</w:t>
-            </w:r>
+              <w:t>JWT oluşturma (</w:t>
+            </w:r>
+            <w:proofErr w:type="spellStart"/>
+            <w:r>
+              <w:t>python-jose</w:t>
+            </w:r>
+            <w:proofErr w:type="spellEnd"/>
+            <w:r>
+              <w:t xml:space="preserve">) ve doğrulama </w:t>
+            </w:r>
+            <w:proofErr w:type="spellStart"/>
+            <w:r>
+              <w:t>middleware</w:t>
+            </w:r>
+            <w:proofErr w:type="spellEnd"/>
           </w:p>
         </w:tc>
         <w:tc>
@@ -1041,9 +1456,11 @@
             <w:pPr>
               <w:pStyle w:val="TableContents"/>
             </w:pPr>
+            <w:proofErr w:type="spellStart"/>
             <w:r>
               <w:t>Backend</w:t>
             </w:r>
+            <w:proofErr w:type="spellEnd"/>
           </w:p>
         </w:tc>
       </w:tr>
@@ -1084,7 +1501,23 @@
               <w:pStyle w:val="TableContents"/>
             </w:pPr>
             <w:r>
-              <w:t>Kullanıcı profili endpoint'leri (ad, boy, kilo, kronik durum, premium)</w:t>
+              <w:t xml:space="preserve">Kullanıcı profili </w:t>
+            </w:r>
+            <w:proofErr w:type="spellStart"/>
+            <w:r>
+              <w:t>endpoint'leri</w:t>
+            </w:r>
+            <w:proofErr w:type="spellEnd"/>
+            <w:r>
+              <w:t xml:space="preserve"> (ad, boy, kilo, kronik durum, </w:t>
+            </w:r>
+            <w:proofErr w:type="spellStart"/>
+            <w:r>
+              <w:t>premium</w:t>
+            </w:r>
+            <w:proofErr w:type="spellEnd"/>
+            <w:r>
+              <w:t>)</w:t>
             </w:r>
           </w:p>
         </w:tc>
@@ -1103,9 +1536,11 @@
             <w:pPr>
               <w:pStyle w:val="TableContents"/>
             </w:pPr>
+            <w:proofErr w:type="spellStart"/>
             <w:r>
               <w:t>Backend</w:t>
             </w:r>
+            <w:proofErr w:type="spellEnd"/>
           </w:p>
         </w:tc>
       </w:tr>
@@ -1152,14 +1587,52 @@
               <w:t>Yeni</w:t>
             </w:r>
             <w:r>
-              <w:t>: Paycell ödeme simülasyonu ve abonelik yönetimi endpoint'leri (</w:t>
+              <w:t xml:space="preserve">: </w:t>
+            </w:r>
+            <w:proofErr w:type="spellStart"/>
+            <w:r>
+              <w:t>Paycell</w:t>
+            </w:r>
+            <w:proofErr w:type="spellEnd"/>
+            <w:r>
+              <w:t xml:space="preserve"> ödeme simülasyonu ve abonelik yönetimi </w:t>
+            </w:r>
+            <w:proofErr w:type="spellStart"/>
+            <w:r>
+              <w:t>endpoint'leri</w:t>
+            </w:r>
+            <w:proofErr w:type="spellEnd"/>
+            <w:r>
+              <w:t xml:space="preserve"> (</w:t>
             </w:r>
             <w:r>
               <w:rPr>
                 <w:rStyle w:val="SourceText"/>
               </w:rPr>
-              <w:t>POST /payment/upgrade</w:t>
-            </w:r>
+              <w:t>POST /</w:t>
+            </w:r>
+            <w:proofErr w:type="spellStart"/>
+            <w:r>
+              <w:rPr>
+                <w:rStyle w:val="SourceText"/>
+              </w:rPr>
+              <w:t>payment</w:t>
+            </w:r>
+            <w:proofErr w:type="spellEnd"/>
+            <w:r>
+              <w:rPr>
+                <w:rStyle w:val="SourceText"/>
+              </w:rPr>
+              <w:t>/</w:t>
+            </w:r>
+            <w:proofErr w:type="spellStart"/>
+            <w:r>
+              <w:rPr>
+                <w:rStyle w:val="SourceText"/>
+              </w:rPr>
+              <w:t>upgrade</w:t>
+            </w:r>
+            <w:proofErr w:type="spellEnd"/>
             <w:r>
               <w:t xml:space="preserve">, </w:t>
             </w:r>
@@ -1167,8 +1640,30 @@
               <w:rPr>
                 <w:rStyle w:val="SourceText"/>
               </w:rPr>
-              <w:t>GET /payment/history</w:t>
-            </w:r>
+              <w:t>GET /</w:t>
+            </w:r>
+            <w:proofErr w:type="spellStart"/>
+            <w:r>
+              <w:rPr>
+                <w:rStyle w:val="SourceText"/>
+              </w:rPr>
+              <w:t>payment</w:t>
+            </w:r>
+            <w:proofErr w:type="spellEnd"/>
+            <w:r>
+              <w:rPr>
+                <w:rStyle w:val="SourceText"/>
+              </w:rPr>
+              <w:t>/</w:t>
+            </w:r>
+            <w:proofErr w:type="spellStart"/>
+            <w:r>
+              <w:rPr>
+                <w:rStyle w:val="SourceText"/>
+              </w:rPr>
+              <w:t>history</w:t>
+            </w:r>
+            <w:proofErr w:type="spellEnd"/>
             <w:r>
               <w:t xml:space="preserve">, </w:t>
             </w:r>
@@ -1176,8 +1671,16 @@
               <w:rPr>
                 <w:rStyle w:val="SourceText"/>
               </w:rPr>
-              <w:t>DELETE /subscription</w:t>
-            </w:r>
+              <w:t>DELETE /</w:t>
+            </w:r>
+            <w:proofErr w:type="spellStart"/>
+            <w:r>
+              <w:rPr>
+                <w:rStyle w:val="SourceText"/>
+              </w:rPr>
+              <w:t>subscription</w:t>
+            </w:r>
+            <w:proofErr w:type="spellEnd"/>
             <w:r>
               <w:t>)</w:t>
             </w:r>
@@ -1198,9 +1701,11 @@
             <w:pPr>
               <w:pStyle w:val="TableContents"/>
             </w:pPr>
+            <w:proofErr w:type="spellStart"/>
             <w:r>
               <w:t>Backend</w:t>
             </w:r>
+            <w:proofErr w:type="spellEnd"/>
           </w:p>
         </w:tc>
       </w:tr>
@@ -1260,9 +1765,11 @@
             <w:pPr>
               <w:pStyle w:val="TableContents"/>
             </w:pPr>
+            <w:proofErr w:type="spellStart"/>
             <w:r>
               <w:t>Backend</w:t>
             </w:r>
+            <w:proofErr w:type="spellEnd"/>
           </w:p>
         </w:tc>
       </w:tr>
@@ -1303,7 +1810,23 @@
               <w:pStyle w:val="TableContents"/>
             </w:pPr>
             <w:r>
-              <w:t>GSM kayıt/giriş ekranı (Jetpack Compose)</w:t>
+              <w:t>GSM kayıt/giriş ekranı (</w:t>
+            </w:r>
+            <w:proofErr w:type="spellStart"/>
+            <w:r>
+              <w:t>Jetpack</w:t>
+            </w:r>
+            <w:proofErr w:type="spellEnd"/>
+            <w:r>
+              <w:t xml:space="preserve"> </w:t>
+            </w:r>
+            <w:proofErr w:type="spellStart"/>
+            <w:r>
+              <w:t>Compose</w:t>
+            </w:r>
+            <w:proofErr w:type="spellEnd"/>
+            <w:r>
+              <w:t>)</w:t>
             </w:r>
           </w:p>
         </w:tc>
@@ -1322,9 +1845,11 @@
             <w:pPr>
               <w:pStyle w:val="TableContents"/>
             </w:pPr>
+            <w:proofErr w:type="spellStart"/>
             <w:r>
               <w:t>Android</w:t>
             </w:r>
+            <w:proofErr w:type="spellEnd"/>
           </w:p>
         </w:tc>
       </w:tr>
@@ -1365,10 +1890,50 @@
               <w:pStyle w:val="TableContents"/>
             </w:pPr>
             <w:r>
-              <w:t>JWT yönetimi (DataStore'da saklama, interceptor ile token yenileme</w:t>
-            </w:r>
-            <w:r>
-              <w:t>- BU KISM İÇİN melike endpoint vereceğ</w:t>
+              <w:t>JWT yönetimi (</w:t>
+            </w:r>
+            <w:proofErr w:type="spellStart"/>
+            <w:r>
+              <w:t>DataStore'da</w:t>
+            </w:r>
+            <w:proofErr w:type="spellEnd"/>
+            <w:r>
+              <w:t xml:space="preserve"> saklama, </w:t>
+            </w:r>
+            <w:proofErr w:type="spellStart"/>
+            <w:r>
+              <w:t>interceptor</w:t>
+            </w:r>
+            <w:proofErr w:type="spellEnd"/>
+            <w:r>
+              <w:t xml:space="preserve"> ile </w:t>
+            </w:r>
+            <w:proofErr w:type="spellStart"/>
+            <w:r>
+              <w:t>token</w:t>
+            </w:r>
+            <w:proofErr w:type="spellEnd"/>
+            <w:r>
+              <w:t xml:space="preserve"> yenileme</w:t>
+            </w:r>
+            <w:r>
+              <w:t xml:space="preserve">- BU KISM İÇİN </w:t>
+            </w:r>
+            <w:proofErr w:type="gramStart"/>
+            <w:r>
+              <w:t>melike</w:t>
+            </w:r>
+            <w:proofErr w:type="gramEnd"/>
+            <w:r>
+              <w:t xml:space="preserve"> </w:t>
+            </w:r>
+            <w:proofErr w:type="spellStart"/>
+            <w:r>
+              <w:t>endpoint</w:t>
+            </w:r>
+            <w:proofErr w:type="spellEnd"/>
+            <w:r>
+              <w:t xml:space="preserve"> vereceğ</w:t>
             </w:r>
             <w:r>
               <w:t>im ona bakmam lazım.</w:t>
@@ -1393,9 +1958,11 @@
             <w:pPr>
               <w:pStyle w:val="TableContents"/>
             </w:pPr>
+            <w:proofErr w:type="spellStart"/>
             <w:r>
               <w:t>Android</w:t>
             </w:r>
+            <w:proofErr w:type="spellEnd"/>
           </w:p>
         </w:tc>
       </w:tr>
@@ -1455,9 +2022,11 @@
             <w:pPr>
               <w:pStyle w:val="TableContents"/>
             </w:pPr>
+            <w:proofErr w:type="spellStart"/>
             <w:r>
               <w:t>Android</w:t>
             </w:r>
+            <w:proofErr w:type="spellEnd"/>
           </w:p>
         </w:tc>
       </w:tr>
@@ -1523,9 +2092,11 @@
             <w:pPr>
               <w:pStyle w:val="TableContents"/>
             </w:pPr>
+            <w:proofErr w:type="spellStart"/>
             <w:r>
               <w:t>Android</w:t>
             </w:r>
+            <w:proofErr w:type="spellEnd"/>
           </w:p>
         </w:tc>
       </w:tr>
@@ -1674,12 +2245,14 @@
             <w:r>
               <w:t xml:space="preserve"> </w:t>
             </w:r>
+            <w:proofErr w:type="spellStart"/>
             <w:r>
               <w:rPr>
                 <w:rStyle w:val="SourceText"/>
               </w:rPr>
               <w:t>users</w:t>
             </w:r>
+            <w:proofErr w:type="spellEnd"/>
             <w:r>
               <w:t xml:space="preserve"> tablosuna </w:t>
             </w:r>
@@ -1692,32 +2265,62 @@
             <w:r>
               <w:t xml:space="preserve"> alanı eklenmesi (varsayılan: </w:t>
             </w:r>
+            <w:proofErr w:type="spellStart"/>
             <w:r>
               <w:rPr>
                 <w:rStyle w:val="SourceText"/>
               </w:rPr>
               <w:t>user</w:t>
             </w:r>
-            <w:r>
-              <w:t xml:space="preserve">, opsiyonel: </w:t>
-            </w:r>
+            <w:proofErr w:type="spellEnd"/>
+            <w:r>
+              <w:t xml:space="preserve">, </w:t>
+            </w:r>
+            <w:proofErr w:type="spellStart"/>
+            <w:r>
+              <w:t>opsiyonel</w:t>
+            </w:r>
+            <w:proofErr w:type="spellEnd"/>
+            <w:r>
+              <w:t xml:space="preserve">: </w:t>
+            </w:r>
+            <w:proofErr w:type="spellStart"/>
             <w:r>
               <w:rPr>
                 <w:rStyle w:val="SourceText"/>
               </w:rPr>
               <w:t>premium_user</w:t>
             </w:r>
+            <w:proofErr w:type="spellEnd"/>
             <w:r>
               <w:t xml:space="preserve">, </w:t>
             </w:r>
+            <w:proofErr w:type="spellStart"/>
             <w:r>
               <w:rPr>
                 <w:rStyle w:val="SourceText"/>
               </w:rPr>
               <w:t>admin</w:t>
             </w:r>
-            <w:r>
-              <w:t xml:space="preserve">). JWT token payload'ına </w:t>
+            <w:proofErr w:type="spellEnd"/>
+            <w:r>
+              <w:t xml:space="preserve">). JWT </w:t>
+            </w:r>
+            <w:proofErr w:type="spellStart"/>
+            <w:r>
+              <w:t>token</w:t>
+            </w:r>
+            <w:proofErr w:type="spellEnd"/>
+            <w:r>
+              <w:t xml:space="preserve"> </w:t>
+            </w:r>
+            <w:proofErr w:type="spellStart"/>
+            <w:r>
+              <w:t>payload'ına</w:t>
+            </w:r>
+            <w:proofErr w:type="spellEnd"/>
+            <w:r>
+              <w:t xml:space="preserve"> </w:t>
             </w:r>
             <w:r>
               <w:rPr>
@@ -1745,9 +2348,19 @@
             <w:pPr>
               <w:pStyle w:val="TableContents"/>
             </w:pPr>
-            <w:r>
-              <w:t>Veritabanı &amp; Backend</w:t>
-            </w:r>
+            <w:proofErr w:type="spellStart"/>
+            <w:r>
+              <w:t>Veritabanı</w:t>
+            </w:r>
+            <w:proofErr w:type="spellEnd"/>
+            <w:r>
+              <w:t xml:space="preserve"> &amp; </w:t>
+            </w:r>
+            <w:proofErr w:type="spellStart"/>
+            <w:r>
+              <w:t>Backend</w:t>
+            </w:r>
+            <w:proofErr w:type="spellEnd"/>
           </w:p>
         </w:tc>
       </w:tr>
@@ -1790,32 +2403,108 @@
             <w:pPr>
               <w:pStyle w:val="TableContents"/>
             </w:pPr>
+            <w:proofErr w:type="spellStart"/>
             <w:r>
               <w:rPr>
                 <w:rStyle w:val="StrongEmphasis"/>
               </w:rPr>
-              <w:t>Admin Yetkilendirme Middleware'i:</w:t>
-            </w:r>
-            <w:r>
-              <w:t xml:space="preserve"> FastAPI'de </w:t>
+              <w:t>Admin</w:t>
+            </w:r>
+            <w:proofErr w:type="spellEnd"/>
+            <w:r>
+              <w:rPr>
+                <w:rStyle w:val="StrongEmphasis"/>
+              </w:rPr>
+              <w:t xml:space="preserve"> Yetkilendirme </w:t>
+            </w:r>
+            <w:proofErr w:type="spellStart"/>
+            <w:r>
+              <w:rPr>
+                <w:rStyle w:val="StrongEmphasis"/>
+              </w:rPr>
+              <w:t>Middleware'i</w:t>
+            </w:r>
+            <w:proofErr w:type="spellEnd"/>
+            <w:r>
+              <w:rPr>
+                <w:rStyle w:val="StrongEmphasis"/>
+              </w:rPr>
+              <w:t>:</w:t>
+            </w:r>
+            <w:r>
+              <w:t xml:space="preserve"> </w:t>
+            </w:r>
+            <w:proofErr w:type="spellStart"/>
+            <w:r>
+              <w:t>FastAPI'de</w:t>
+            </w:r>
+            <w:proofErr w:type="spellEnd"/>
+            <w:r>
+              <w:t xml:space="preserve"> </w:t>
             </w:r>
             <w:r>
               <w:rPr>
                 <w:rStyle w:val="SourceText"/>
               </w:rPr>
-              <w:t>/admin/*</w:t>
-            </w:r>
-            <w:r>
-              <w:t xml:space="preserve"> rotalarını koruyan, gelen JWT'de </w:t>
-            </w:r>
+              <w:t>/</w:t>
+            </w:r>
+            <w:proofErr w:type="spellStart"/>
             <w:r>
               <w:rPr>
                 <w:rStyle w:val="SourceText"/>
               </w:rPr>
-              <w:t>role: admin</w:t>
-            </w:r>
-            <w:r>
-              <w:t xml:space="preserve"> kontrolü yapan bir dependency/middleware yazılması.</w:t>
+              <w:t>admin</w:t>
+            </w:r>
+            <w:proofErr w:type="spellEnd"/>
+            <w:r>
+              <w:rPr>
+                <w:rStyle w:val="SourceText"/>
+              </w:rPr>
+              <w:t>/*</w:t>
+            </w:r>
+            <w:r>
+              <w:t xml:space="preserve"> rotalarını koruyan, gelen </w:t>
+            </w:r>
+            <w:proofErr w:type="spellStart"/>
+            <w:r>
+              <w:t>JWT'de</w:t>
+            </w:r>
+            <w:proofErr w:type="spellEnd"/>
+            <w:r>
+              <w:t xml:space="preserve"> </w:t>
+            </w:r>
+            <w:r>
+              <w:rPr>
+                <w:rStyle w:val="SourceText"/>
+              </w:rPr>
+              <w:t xml:space="preserve">role: </w:t>
+            </w:r>
+            <w:proofErr w:type="spellStart"/>
+            <w:r>
+              <w:rPr>
+                <w:rStyle w:val="SourceText"/>
+              </w:rPr>
+              <w:t>admin</w:t>
+            </w:r>
+            <w:proofErr w:type="spellEnd"/>
+            <w:r>
+              <w:t xml:space="preserve"> kontrolü yapan bir </w:t>
+            </w:r>
+            <w:proofErr w:type="spellStart"/>
+            <w:r>
+              <w:t>dependency</w:t>
+            </w:r>
+            <w:proofErr w:type="spellEnd"/>
+            <w:r>
+              <w:t>/</w:t>
+            </w:r>
+            <w:proofErr w:type="spellStart"/>
+            <w:r>
+              <w:t>middleware</w:t>
+            </w:r>
+            <w:proofErr w:type="spellEnd"/>
+            <w:r>
+              <w:t xml:space="preserve"> yazılması.</w:t>
             </w:r>
           </w:p>
         </w:tc>
@@ -1834,9 +2523,11 @@
             <w:pPr>
               <w:pStyle w:val="TableContents"/>
             </w:pPr>
+            <w:proofErr w:type="spellStart"/>
             <w:r>
               <w:t>Backend</w:t>
             </w:r>
+            <w:proofErr w:type="spellEnd"/>
           </w:p>
         </w:tc>
       </w:tr>
@@ -1879,14 +2570,54 @@
             <w:pPr>
               <w:pStyle w:val="TableContents"/>
             </w:pPr>
+            <w:proofErr w:type="spellStart"/>
             <w:r>
               <w:rPr>
                 <w:rStyle w:val="StrongEmphasis"/>
               </w:rPr>
-              <w:t>Admin Kullanıcı Tanımlama:</w:t>
-            </w:r>
-            <w:r>
-              <w:t xml:space="preserve"> Sisteme ilk admin kullanıcısını eklemek için özel bir seed script veya komut satırı aracı yazılması (manuel veritabanı kaydı oluşturma).</w:t>
+              <w:t>Admin</w:t>
+            </w:r>
+            <w:proofErr w:type="spellEnd"/>
+            <w:r>
+              <w:rPr>
+                <w:rStyle w:val="StrongEmphasis"/>
+              </w:rPr>
+              <w:t xml:space="preserve"> Kullanıcı Tanımlama:</w:t>
+            </w:r>
+            <w:r>
+              <w:t xml:space="preserve"> Sisteme ilk </w:t>
+            </w:r>
+            <w:proofErr w:type="spellStart"/>
+            <w:r>
+              <w:t>admin</w:t>
+            </w:r>
+            <w:proofErr w:type="spellEnd"/>
+            <w:r>
+              <w:t xml:space="preserve"> kullanıcısını eklemek için özel bir </w:t>
+            </w:r>
+            <w:proofErr w:type="spellStart"/>
+            <w:r>
+              <w:t>seed</w:t>
+            </w:r>
+            <w:proofErr w:type="spellEnd"/>
+            <w:r>
+              <w:t xml:space="preserve"> </w:t>
+            </w:r>
+            <w:proofErr w:type="spellStart"/>
+            <w:r>
+              <w:t>script</w:t>
+            </w:r>
+            <w:proofErr w:type="spellEnd"/>
+            <w:r>
+              <w:t xml:space="preserve"> veya komut satırı aracı yazılması (manuel </w:t>
+            </w:r>
+            <w:proofErr w:type="spellStart"/>
+            <w:r>
+              <w:t>veritabanı</w:t>
+            </w:r>
+            <w:proofErr w:type="spellEnd"/>
+            <w:r>
+              <w:t xml:space="preserve"> kaydı oluşturma).</w:t>
             </w:r>
           </w:p>
         </w:tc>
@@ -1905,9 +2636,11 @@
             <w:pPr>
               <w:pStyle w:val="TableContents"/>
             </w:pPr>
+            <w:proofErr w:type="spellStart"/>
             <w:r>
               <w:t>Backend</w:t>
             </w:r>
+            <w:proofErr w:type="spellEnd"/>
           </w:p>
         </w:tc>
       </w:tr>
@@ -1950,11 +2683,33 @@
             <w:pPr>
               <w:pStyle w:val="TableContents"/>
             </w:pPr>
+            <w:proofErr w:type="spellStart"/>
             <w:r>
               <w:rPr>
                 <w:rStyle w:val="StrongEmphasis"/>
               </w:rPr>
-              <w:t>Admin Dashboard API Endpoint'leri:</w:t>
+              <w:t>Admin</w:t>
+            </w:r>
+            <w:proofErr w:type="spellEnd"/>
+            <w:r>
+              <w:rPr>
+                <w:rStyle w:val="StrongEmphasis"/>
+              </w:rPr>
+              <w:t xml:space="preserve"> Dashboard API </w:t>
+            </w:r>
+            <w:proofErr w:type="spellStart"/>
+            <w:r>
+              <w:rPr>
+                <w:rStyle w:val="StrongEmphasis"/>
+              </w:rPr>
+              <w:t>Endpoint'leri</w:t>
+            </w:r>
+            <w:proofErr w:type="spellEnd"/>
+            <w:r>
+              <w:rPr>
+                <w:rStyle w:val="StrongEmphasis"/>
+              </w:rPr>
+              <w:t>:</w:t>
             </w:r>
           </w:p>
         </w:tc>
@@ -2024,10 +2779,40 @@
               <w:rPr>
                 <w:rStyle w:val="SourceText"/>
               </w:rPr>
-              <w:t>GET /admin/stats</w:t>
-            </w:r>
-            <w:r>
-              <w:t>: Toplam kullanıcı, premium kullanıcı, aktif hedef sayısı gibi anlık sistem istatistikleri.</w:t>
+              <w:t>GET /</w:t>
+            </w:r>
+            <w:proofErr w:type="spellStart"/>
+            <w:r>
+              <w:rPr>
+                <w:rStyle w:val="SourceText"/>
+              </w:rPr>
+              <w:t>admin</w:t>
+            </w:r>
+            <w:proofErr w:type="spellEnd"/>
+            <w:r>
+              <w:rPr>
+                <w:rStyle w:val="SourceText"/>
+              </w:rPr>
+              <w:t>/</w:t>
+            </w:r>
+            <w:proofErr w:type="spellStart"/>
+            <w:r>
+              <w:rPr>
+                <w:rStyle w:val="SourceText"/>
+              </w:rPr>
+              <w:t>stats</w:t>
+            </w:r>
+            <w:proofErr w:type="spellEnd"/>
+            <w:r>
+              <w:t xml:space="preserve">: Toplam kullanıcı, </w:t>
+            </w:r>
+            <w:proofErr w:type="spellStart"/>
+            <w:r>
+              <w:t>premium</w:t>
+            </w:r>
+            <w:proofErr w:type="spellEnd"/>
+            <w:r>
+              <w:t xml:space="preserve"> kullanıcı, aktif hedef sayısı gibi anlık sistem istatistikleri.</w:t>
             </w:r>
           </w:p>
         </w:tc>
@@ -2046,9 +2831,11 @@
             <w:pPr>
               <w:pStyle w:val="TableContents"/>
             </w:pPr>
+            <w:proofErr w:type="spellStart"/>
             <w:r>
               <w:t>Backend</w:t>
             </w:r>
+            <w:proofErr w:type="spellEnd"/>
           </w:p>
         </w:tc>
       </w:tr>
@@ -2096,8 +2883,30 @@
               <w:rPr>
                 <w:rStyle w:val="SourceText"/>
               </w:rPr>
-              <w:t>GET /admin/users</w:t>
-            </w:r>
+              <w:t>GET /</w:t>
+            </w:r>
+            <w:proofErr w:type="spellStart"/>
+            <w:r>
+              <w:rPr>
+                <w:rStyle w:val="SourceText"/>
+              </w:rPr>
+              <w:t>admin</w:t>
+            </w:r>
+            <w:proofErr w:type="spellEnd"/>
+            <w:r>
+              <w:rPr>
+                <w:rStyle w:val="SourceText"/>
+              </w:rPr>
+              <w:t>/</w:t>
+            </w:r>
+            <w:proofErr w:type="spellStart"/>
+            <w:r>
+              <w:rPr>
+                <w:rStyle w:val="SourceText"/>
+              </w:rPr>
+              <w:t>users</w:t>
+            </w:r>
+            <w:proofErr w:type="spellEnd"/>
             <w:r>
               <w:t>: Kullanıcı listesi (arama, filtreleme, role göre sıralama ile).</w:t>
             </w:r>
@@ -2118,9 +2927,11 @@
             <w:pPr>
               <w:pStyle w:val="TableContents"/>
             </w:pPr>
+            <w:proofErr w:type="spellStart"/>
             <w:r>
               <w:t>Backend</w:t>
             </w:r>
+            <w:proofErr w:type="spellEnd"/>
           </w:p>
         </w:tc>
       </w:tr>
@@ -2168,28 +2979,93 @@
               <w:rPr>
                 <w:rStyle w:val="SourceText"/>
               </w:rPr>
-              <w:t>PUT /admin/users/{id}/role</w:t>
-            </w:r>
-            <w:r>
-              <w:t xml:space="preserve">: Bir kullanıcının rolünü güncelleme (örn. </w:t>
-            </w:r>
+              <w:t>PUT /</w:t>
+            </w:r>
+            <w:proofErr w:type="spellStart"/>
             <w:r>
               <w:rPr>
                 <w:rStyle w:val="SourceText"/>
               </w:rPr>
+              <w:t>admin</w:t>
+            </w:r>
+            <w:proofErr w:type="spellEnd"/>
+            <w:r>
+              <w:rPr>
+                <w:rStyle w:val="SourceText"/>
+              </w:rPr>
+              <w:t>/</w:t>
+            </w:r>
+            <w:proofErr w:type="spellStart"/>
+            <w:r>
+              <w:rPr>
+                <w:rStyle w:val="SourceText"/>
+              </w:rPr>
+              <w:t>users</w:t>
+            </w:r>
+            <w:proofErr w:type="spellEnd"/>
+            <w:r>
+              <w:rPr>
+                <w:rStyle w:val="SourceText"/>
+              </w:rPr>
+              <w:t>/{</w:t>
+            </w:r>
+            <w:proofErr w:type="spellStart"/>
+            <w:r>
+              <w:rPr>
+                <w:rStyle w:val="SourceText"/>
+              </w:rPr>
+              <w:t>id</w:t>
+            </w:r>
+            <w:proofErr w:type="spellEnd"/>
+            <w:r>
+              <w:rPr>
+                <w:rStyle w:val="SourceText"/>
+              </w:rPr>
+              <w:t>}/role</w:t>
+            </w:r>
+            <w:r>
+              <w:t>: Bir kullanıcının rolünü güncelleme (</w:t>
+            </w:r>
+            <w:proofErr w:type="spellStart"/>
+            <w:r>
+              <w:t>örn</w:t>
+            </w:r>
+            <w:proofErr w:type="spellEnd"/>
+            <w:r>
+              <w:t xml:space="preserve">. </w:t>
+            </w:r>
+            <w:proofErr w:type="spellStart"/>
+            <w:r>
+              <w:rPr>
+                <w:rStyle w:val="SourceText"/>
+              </w:rPr>
               <w:t>user</w:t>
             </w:r>
             <w:r>
-              <w:t xml:space="preserve">'ı </w:t>
-            </w:r>
+              <w:t>'ı</w:t>
+            </w:r>
+            <w:proofErr w:type="spellEnd"/>
+            <w:r>
+              <w:t xml:space="preserve"> </w:t>
+            </w:r>
+            <w:proofErr w:type="spellStart"/>
             <w:r>
               <w:rPr>
                 <w:rStyle w:val="SourceText"/>
               </w:rPr>
               <w:t>premium_user</w:t>
             </w:r>
-            <w:r>
-              <w:t xml:space="preserve"> yapma veya admin atama).</w:t>
+            <w:proofErr w:type="spellEnd"/>
+            <w:r>
+              <w:t xml:space="preserve"> yapma veya </w:t>
+            </w:r>
+            <w:proofErr w:type="spellStart"/>
+            <w:r>
+              <w:t>admin</w:t>
+            </w:r>
+            <w:proofErr w:type="spellEnd"/>
+            <w:r>
+              <w:t xml:space="preserve"> atama).</w:t>
             </w:r>
           </w:p>
         </w:tc>
@@ -2208,9 +3084,11 @@
             <w:pPr>
               <w:pStyle w:val="TableContents"/>
             </w:pPr>
+            <w:proofErr w:type="spellStart"/>
             <w:r>
               <w:t>Backend</w:t>
             </w:r>
+            <w:proofErr w:type="spellEnd"/>
           </w:p>
         </w:tc>
       </w:tr>
@@ -2258,7 +3136,49 @@
               <w:rPr>
                 <w:rStyle w:val="SourceText"/>
               </w:rPr>
-              <w:t>DELETE /admin/users/{id}</w:t>
+              <w:t>DELETE /</w:t>
+            </w:r>
+            <w:proofErr w:type="spellStart"/>
+            <w:r>
+              <w:rPr>
+                <w:rStyle w:val="SourceText"/>
+              </w:rPr>
+              <w:t>admin</w:t>
+            </w:r>
+            <w:proofErr w:type="spellEnd"/>
+            <w:r>
+              <w:rPr>
+                <w:rStyle w:val="SourceText"/>
+              </w:rPr>
+              <w:t>/</w:t>
+            </w:r>
+            <w:proofErr w:type="spellStart"/>
+            <w:r>
+              <w:rPr>
+                <w:rStyle w:val="SourceText"/>
+              </w:rPr>
+              <w:t>users</w:t>
+            </w:r>
+            <w:proofErr w:type="spellEnd"/>
+            <w:r>
+              <w:rPr>
+                <w:rStyle w:val="SourceText"/>
+              </w:rPr>
+              <w:t>/{</w:t>
+            </w:r>
+            <w:proofErr w:type="spellStart"/>
+            <w:r>
+              <w:rPr>
+                <w:rStyle w:val="SourceText"/>
+              </w:rPr>
+              <w:t>id</w:t>
+            </w:r>
+            <w:proofErr w:type="spellEnd"/>
+            <w:r>
+              <w:rPr>
+                <w:rStyle w:val="SourceText"/>
+              </w:rPr>
+              <w:t>}</w:t>
             </w:r>
             <w:r>
               <w:t>: Kullanıcı hesabını ve ilişkili tüm verilerini silme.</w:t>
@@ -2280,9 +3200,11 @@
             <w:pPr>
               <w:pStyle w:val="TableContents"/>
             </w:pPr>
+            <w:proofErr w:type="spellStart"/>
             <w:r>
               <w:t>Backend</w:t>
             </w:r>
+            <w:proofErr w:type="spellEnd"/>
           </w:p>
         </w:tc>
       </w:tr>
@@ -2329,10 +3251,46 @@
               <w:rPr>
                 <w:rStyle w:val="StrongEmphasis"/>
               </w:rPr>
-              <w:t>İçerik Yönetimi API'leri (Opsiyonel):</w:t>
-            </w:r>
-            <w:r>
-              <w:t xml:space="preserve"> Rozet tanımları ve bildirim şablonlarını yönetmek için CRUD endpoint'leri.</w:t>
+              <w:t xml:space="preserve">İçerik Yönetimi </w:t>
+            </w:r>
+            <w:proofErr w:type="spellStart"/>
+            <w:r>
+              <w:rPr>
+                <w:rStyle w:val="StrongEmphasis"/>
+              </w:rPr>
+              <w:t>API'leri</w:t>
+            </w:r>
+            <w:proofErr w:type="spellEnd"/>
+            <w:r>
+              <w:rPr>
+                <w:rStyle w:val="StrongEmphasis"/>
+              </w:rPr>
+              <w:t xml:space="preserve"> (</w:t>
+            </w:r>
+            <w:proofErr w:type="spellStart"/>
+            <w:r>
+              <w:rPr>
+                <w:rStyle w:val="StrongEmphasis"/>
+              </w:rPr>
+              <w:t>Opsiyonel</w:t>
+            </w:r>
+            <w:proofErr w:type="spellEnd"/>
+            <w:r>
+              <w:rPr>
+                <w:rStyle w:val="StrongEmphasis"/>
+              </w:rPr>
+              <w:t>):</w:t>
+            </w:r>
+            <w:r>
+              <w:t xml:space="preserve"> Rozet tanımları ve bildirim şablonlarını yönetmek için CRUD </w:t>
+            </w:r>
+            <w:proofErr w:type="spellStart"/>
+            <w:r>
+              <w:t>endpoint'leri</w:t>
+            </w:r>
+            <w:proofErr w:type="spellEnd"/>
+            <w:r>
+              <w:t>.</w:t>
             </w:r>
           </w:p>
         </w:tc>
@@ -2351,9 +3309,11 @@
             <w:pPr>
               <w:pStyle w:val="TableContents"/>
             </w:pPr>
+            <w:proofErr w:type="spellStart"/>
             <w:r>
               <w:t>Backend</w:t>
             </w:r>
+            <w:proofErr w:type="spellEnd"/>
           </w:p>
         </w:tc>
       </w:tr>
@@ -2396,23 +3356,109 @@
             <w:pPr>
               <w:pStyle w:val="TableContents"/>
             </w:pPr>
+            <w:proofErr w:type="spellStart"/>
             <w:r>
               <w:rPr>
                 <w:rStyle w:val="StrongEmphasis"/>
               </w:rPr>
-              <w:t>Admin Web Arayüzü (Basit Panel):</w:t>
-            </w:r>
-            <w:r>
-              <w:t xml:space="preserve"> Backend geliştirici tarafından, hızlıca bir HTML template (Jinja2) veya basit bir React sayfası ile admin dashboard'unun oluşturulması. Bu panel, yukarıdaki API'leri kullanacak. </w:t>
-            </w:r>
+              <w:t>Admin</w:t>
+            </w:r>
+            <w:proofErr w:type="spellEnd"/>
             <w:r>
               <w:rPr>
                 <w:rStyle w:val="StrongEmphasis"/>
               </w:rPr>
+              <w:t xml:space="preserve"> Web </w:t>
+            </w:r>
+            <w:proofErr w:type="spellStart"/>
+            <w:r>
+              <w:rPr>
+                <w:rStyle w:val="StrongEmphasis"/>
+              </w:rPr>
+              <w:t>Arayüzü</w:t>
+            </w:r>
+            <w:proofErr w:type="spellEnd"/>
+            <w:r>
+              <w:rPr>
+                <w:rStyle w:val="StrongEmphasis"/>
+              </w:rPr>
+              <w:t xml:space="preserve"> (Basit Panel):</w:t>
+            </w:r>
+            <w:r>
+              <w:t xml:space="preserve"> </w:t>
+            </w:r>
+            <w:proofErr w:type="spellStart"/>
+            <w:r>
+              <w:t>Backend</w:t>
+            </w:r>
+            <w:proofErr w:type="spellEnd"/>
+            <w:r>
+              <w:t xml:space="preserve"> geliştirici tarafından, hızlıca bir HTML </w:t>
+            </w:r>
+            <w:proofErr w:type="spellStart"/>
+            <w:r>
+              <w:t>template</w:t>
+            </w:r>
+            <w:proofErr w:type="spellEnd"/>
+            <w:r>
+              <w:t xml:space="preserve"> (Jinja2) veya basit bir </w:t>
+            </w:r>
+            <w:proofErr w:type="spellStart"/>
+            <w:r>
+              <w:t>React</w:t>
+            </w:r>
+            <w:proofErr w:type="spellEnd"/>
+            <w:r>
+              <w:t xml:space="preserve"> sayfası ile </w:t>
+            </w:r>
+            <w:proofErr w:type="spellStart"/>
+            <w:r>
+              <w:t>admin</w:t>
+            </w:r>
+            <w:proofErr w:type="spellEnd"/>
+            <w:r>
+              <w:t xml:space="preserve"> </w:t>
+            </w:r>
+            <w:proofErr w:type="spellStart"/>
+            <w:r>
+              <w:t>dashboard'unun</w:t>
+            </w:r>
+            <w:proofErr w:type="spellEnd"/>
+            <w:r>
+              <w:t xml:space="preserve"> oluşturulması. Bu panel, yukarıdaki </w:t>
+            </w:r>
+            <w:proofErr w:type="spellStart"/>
+            <w:r>
+              <w:t>API'leri</w:t>
+            </w:r>
+            <w:proofErr w:type="spellEnd"/>
+            <w:r>
+              <w:t xml:space="preserve"> kullanacak. </w:t>
+            </w:r>
+            <w:r>
+              <w:rPr>
+                <w:rStyle w:val="StrongEmphasis"/>
+              </w:rPr>
               <w:t>Amaç:</w:t>
             </w:r>
             <w:r>
-              <w:t xml:space="preserve"> Android geliştiriciyi bekletmemek için minimum eforla yönetim arayüzü sağlamak.</w:t>
+              <w:t xml:space="preserve"> </w:t>
+            </w:r>
+            <w:proofErr w:type="spellStart"/>
+            <w:r>
+              <w:t>Android</w:t>
+            </w:r>
+            <w:proofErr w:type="spellEnd"/>
+            <w:r>
+              <w:t xml:space="preserve"> geliştiriciyi bekletmemek için minimum eforla yönetim </w:t>
+            </w:r>
+            <w:proofErr w:type="spellStart"/>
+            <w:r>
+              <w:t>arayüzü</w:t>
+            </w:r>
+            <w:proofErr w:type="spellEnd"/>
+            <w:r>
+              <w:t xml:space="preserve"> sağlamak.</w:t>
             </w:r>
           </w:p>
         </w:tc>
@@ -2431,9 +3477,11 @@
             <w:pPr>
               <w:pStyle w:val="TableContents"/>
             </w:pPr>
+            <w:proofErr w:type="spellStart"/>
             <w:r>
               <w:t>Backend</w:t>
             </w:r>
+            <w:proofErr w:type="spellEnd"/>
           </w:p>
         </w:tc>
       </w:tr>
@@ -2476,14 +3524,30 @@
             <w:pPr>
               <w:pStyle w:val="TableContents"/>
             </w:pPr>
+            <w:proofErr w:type="spellStart"/>
             <w:r>
               <w:rPr>
                 <w:rStyle w:val="StrongEmphasis"/>
               </w:rPr>
-              <w:t>Android'de Rol Farkındalığı:</w:t>
-            </w:r>
-            <w:r>
-              <w:t xml:space="preserve"> Kullanıcı giriş yaptıktan sonra JWT'deki </w:t>
+              <w:t>Android'de</w:t>
+            </w:r>
+            <w:proofErr w:type="spellEnd"/>
+            <w:r>
+              <w:rPr>
+                <w:rStyle w:val="StrongEmphasis"/>
+              </w:rPr>
+              <w:t xml:space="preserve"> Rol Farkındalığı:</w:t>
+            </w:r>
+            <w:r>
+              <w:t xml:space="preserve"> Kullanıcı giriş yaptıktan sonra </w:t>
+            </w:r>
+            <w:proofErr w:type="spellStart"/>
+            <w:r>
+              <w:t>JWT'deki</w:t>
+            </w:r>
+            <w:proofErr w:type="spellEnd"/>
+            <w:r>
+              <w:t xml:space="preserve"> </w:t>
             </w:r>
             <w:r>
               <w:rPr>
@@ -2494,14 +3558,32 @@
             <w:r>
               <w:t xml:space="preserve"> bilgisini okuyup, </w:t>
             </w:r>
+            <w:proofErr w:type="spellStart"/>
             <w:r>
               <w:rPr>
                 <w:rStyle w:val="SourceText"/>
               </w:rPr>
               <w:t>admin</w:t>
             </w:r>
-            <w:r>
-              <w:t xml:space="preserve"> rolüne sahipse profil veya ayarlar menüsüne "Admin Paneli" bağlantısı eklenmesi (webview veya harici tarayıcıya yönlendirme).</w:t>
+            <w:proofErr w:type="spellEnd"/>
+            <w:r>
+              <w:t xml:space="preserve"> rolüne sahipse profil veya ayarlar menüsüne "</w:t>
+            </w:r>
+            <w:proofErr w:type="spellStart"/>
+            <w:r>
+              <w:t>Admin</w:t>
+            </w:r>
+            <w:proofErr w:type="spellEnd"/>
+            <w:r>
+              <w:t xml:space="preserve"> Paneli" bağlantısı eklenmesi (</w:t>
+            </w:r>
+            <w:proofErr w:type="spellStart"/>
+            <w:r>
+              <w:t>webview</w:t>
+            </w:r>
+            <w:proofErr w:type="spellEnd"/>
+            <w:r>
+              <w:t xml:space="preserve"> veya harici tarayıcıya yönlendirme).</w:t>
             </w:r>
           </w:p>
         </w:tc>
@@ -2657,16 +3739,40 @@
               <w:pStyle w:val="TableContents"/>
             </w:pPr>
             <w:r>
-              <w:t>Metrik kayıt endpoint'i (</w:t>
+              <w:t xml:space="preserve">Metrik kayıt </w:t>
+            </w:r>
+            <w:proofErr w:type="spellStart"/>
+            <w:r>
+              <w:t>endpoint'i</w:t>
+            </w:r>
+            <w:proofErr w:type="spellEnd"/>
+            <w:r>
+              <w:t xml:space="preserve"> (</w:t>
             </w:r>
             <w:r>
               <w:rPr>
                 <w:rStyle w:val="SourceText"/>
               </w:rPr>
-              <w:t>POST /metrics</w:t>
-            </w:r>
-            <w:r>
-              <w:t>), validasyon, anomali işaretleme</w:t>
+              <w:t>POST /</w:t>
+            </w:r>
+            <w:proofErr w:type="spellStart"/>
+            <w:r>
+              <w:rPr>
+                <w:rStyle w:val="SourceText"/>
+              </w:rPr>
+              <w:t>metrics</w:t>
+            </w:r>
+            <w:proofErr w:type="spellEnd"/>
+            <w:r>
+              <w:t xml:space="preserve">), </w:t>
+            </w:r>
+            <w:proofErr w:type="spellStart"/>
+            <w:r>
+              <w:t>validasyon</w:t>
+            </w:r>
+            <w:proofErr w:type="spellEnd"/>
+            <w:r>
+              <w:t>, anomali işaretleme</w:t>
             </w:r>
           </w:p>
         </w:tc>
@@ -2685,9 +3791,11 @@
             <w:pPr>
               <w:pStyle w:val="TableContents"/>
             </w:pPr>
+            <w:proofErr w:type="spellStart"/>
             <w:r>
               <w:t>Backend</w:t>
             </w:r>
+            <w:proofErr w:type="spellEnd"/>
           </w:p>
         </w:tc>
       </w:tr>
@@ -2728,8 +3836,13 @@
               <w:pStyle w:val="TableContents"/>
             </w:pPr>
             <w:r>
-              <w:t>Toplama stratejileri (SUM, AVG, LAST) ve günlük özet cache</w:t>
-            </w:r>
+              <w:t xml:space="preserve">Toplama stratejileri (SUM, AVG, LAST) ve günlük özet </w:t>
+            </w:r>
+            <w:proofErr w:type="spellStart"/>
+            <w:r>
+              <w:t>cache</w:t>
+            </w:r>
+            <w:proofErr w:type="spellEnd"/>
           </w:p>
         </w:tc>
         <w:tc>
@@ -2747,9 +3860,11 @@
             <w:pPr>
               <w:pStyle w:val="TableContents"/>
             </w:pPr>
+            <w:proofErr w:type="spellStart"/>
             <w:r>
               <w:t>Backend</w:t>
             </w:r>
+            <w:proofErr w:type="spellEnd"/>
           </w:p>
         </w:tc>
       </w:tr>
@@ -2809,9 +3924,11 @@
             <w:pPr>
               <w:pStyle w:val="TableContents"/>
             </w:pPr>
+            <w:proofErr w:type="spellStart"/>
             <w:r>
               <w:t>Backend</w:t>
             </w:r>
+            <w:proofErr w:type="spellEnd"/>
           </w:p>
         </w:tc>
       </w:tr>
@@ -2852,8 +3969,13 @@
               <w:pStyle w:val="TableContents"/>
             </w:pPr>
             <w:r>
-              <w:t>Simülasyon veri üretici endpoint'i</w:t>
-            </w:r>
+              <w:t xml:space="preserve">Simülasyon veri üretici </w:t>
+            </w:r>
+            <w:proofErr w:type="spellStart"/>
+            <w:r>
+              <w:t>endpoint'i</w:t>
+            </w:r>
+            <w:proofErr w:type="spellEnd"/>
           </w:p>
         </w:tc>
         <w:tc>
@@ -2871,9 +3993,11 @@
             <w:pPr>
               <w:pStyle w:val="TableContents"/>
             </w:pPr>
+            <w:proofErr w:type="spellStart"/>
             <w:r>
               <w:t>Backend</w:t>
             </w:r>
+            <w:proofErr w:type="spellEnd"/>
           </w:p>
         </w:tc>
       </w:tr>
@@ -2920,13 +4044,63 @@
               <w:t>Yeni</w:t>
             </w:r>
             <w:r>
-              <w:t>: Arka plan adım sayacı simülatörü için endpoint (</w:t>
+              <w:t xml:space="preserve">: Arka plan adım sayacı simülatörü için </w:t>
+            </w:r>
+            <w:proofErr w:type="spellStart"/>
+            <w:r>
+              <w:t>endpoint</w:t>
+            </w:r>
+            <w:proofErr w:type="spellEnd"/>
+            <w:r>
+              <w:t xml:space="preserve"> (</w:t>
             </w:r>
             <w:r>
               <w:rPr>
                 <w:rStyle w:val="SourceText"/>
               </w:rPr>
-              <w:t>POST /metrics/simulate/steps/start</w:t>
+              <w:t>POST /</w:t>
+            </w:r>
+            <w:proofErr w:type="spellStart"/>
+            <w:r>
+              <w:rPr>
+                <w:rStyle w:val="SourceText"/>
+              </w:rPr>
+              <w:t>metrics</w:t>
+            </w:r>
+            <w:proofErr w:type="spellEnd"/>
+            <w:r>
+              <w:rPr>
+                <w:rStyle w:val="SourceText"/>
+              </w:rPr>
+              <w:t>/</w:t>
+            </w:r>
+            <w:proofErr w:type="spellStart"/>
+            <w:r>
+              <w:rPr>
+                <w:rStyle w:val="SourceText"/>
+              </w:rPr>
+              <w:t>simulate</w:t>
+            </w:r>
+            <w:proofErr w:type="spellEnd"/>
+            <w:r>
+              <w:rPr>
+                <w:rStyle w:val="SourceText"/>
+              </w:rPr>
+              <w:t>/</w:t>
+            </w:r>
+            <w:proofErr w:type="spellStart"/>
+            <w:r>
+              <w:rPr>
+                <w:rStyle w:val="SourceText"/>
+              </w:rPr>
+              <w:t>steps</w:t>
+            </w:r>
+            <w:proofErr w:type="spellEnd"/>
+            <w:r>
+              <w:rPr>
+                <w:rStyle w:val="SourceText"/>
+              </w:rPr>
+              <w:t>/start</w:t>
             </w:r>
             <w:r>
               <w:t xml:space="preserve">, </w:t>
@@ -2938,7 +4112,31 @@
               <w:t>POST .../stop</w:t>
             </w:r>
             <w:r>
-              <w:t>) – kullanıcıya ait sanal adım üretimini başlatır/durdurur, backend'de periyodik olarak adım ekler (Celery task)</w:t>
+              <w:t xml:space="preserve">) – kullanıcıya ait sanal adım üretimini başlatır/durdurur, </w:t>
+            </w:r>
+            <w:proofErr w:type="spellStart"/>
+            <w:r>
+              <w:t>backend'de</w:t>
+            </w:r>
+            <w:proofErr w:type="spellEnd"/>
+            <w:r>
+              <w:t xml:space="preserve"> periyodik olarak adım ekler (</w:t>
+            </w:r>
+            <w:proofErr w:type="spellStart"/>
+            <w:r>
+              <w:t>Celery</w:t>
+            </w:r>
+            <w:proofErr w:type="spellEnd"/>
+            <w:r>
+              <w:t xml:space="preserve"> </w:t>
+            </w:r>
+            <w:proofErr w:type="spellStart"/>
+            <w:r>
+              <w:t>task</w:t>
+            </w:r>
+            <w:proofErr w:type="spellEnd"/>
+            <w:r>
+              <w:t>)</w:t>
             </w:r>
           </w:p>
         </w:tc>
@@ -2957,9 +4155,11 @@
             <w:pPr>
               <w:pStyle w:val="TableContents"/>
             </w:pPr>
+            <w:proofErr w:type="spellStart"/>
             <w:r>
               <w:t>Backend</w:t>
             </w:r>
+            <w:proofErr w:type="spellEnd"/>
           </w:p>
         </w:tc>
       </w:tr>
@@ -2999,21 +4199,33 @@
             <w:pPr>
               <w:pStyle w:val="TableContents"/>
             </w:pPr>
+            <w:proofErr w:type="spellStart"/>
+            <w:proofErr w:type="gramStart"/>
             <w:r>
               <w:rPr>
                 <w:rStyle w:val="SourceText"/>
               </w:rPr>
-              <w:t>health_metrics</w:t>
-            </w:r>
+              <w:t>health</w:t>
+            </w:r>
+            <w:proofErr w:type="gramEnd"/>
+            <w:r>
+              <w:rPr>
+                <w:rStyle w:val="SourceText"/>
+              </w:rPr>
+              <w:t>_metrics</w:t>
+            </w:r>
+            <w:proofErr w:type="spellEnd"/>
             <w:r>
               <w:t xml:space="preserve"> ve </w:t>
             </w:r>
+            <w:proofErr w:type="spellStart"/>
             <w:r>
               <w:rPr>
                 <w:rStyle w:val="SourceText"/>
               </w:rPr>
               <w:t>daily_summary</w:t>
             </w:r>
+            <w:proofErr w:type="spellEnd"/>
             <w:r>
               <w:t xml:space="preserve"> tablolarının yönetimi</w:t>
             </w:r>
@@ -3034,9 +4246,11 @@
             <w:pPr>
               <w:pStyle w:val="TableContents"/>
             </w:pPr>
+            <w:proofErr w:type="spellStart"/>
             <w:r>
               <w:t>Veritabanı</w:t>
             </w:r>
+            <w:proofErr w:type="spellEnd"/>
           </w:p>
         </w:tc>
       </w:tr>
@@ -3077,8 +4291,21 @@
               <w:pStyle w:val="TableContents"/>
             </w:pPr>
             <w:r>
-              <w:t>Metrik giriş UI'ları (adım, su bardağı, uyku, kilo, kalp, kalori öğün) – Jetpack Compose</w:t>
-            </w:r>
+              <w:t xml:space="preserve">Metrik giriş UI'ları (adım, su bardağı, uyku, kilo, kalp, kalori öğün) – </w:t>
+            </w:r>
+            <w:proofErr w:type="spellStart"/>
+            <w:r>
+              <w:t>Jetpack</w:t>
+            </w:r>
+            <w:proofErr w:type="spellEnd"/>
+            <w:r>
+              <w:t xml:space="preserve"> </w:t>
+            </w:r>
+            <w:proofErr w:type="spellStart"/>
+            <w:r>
+              <w:t>Compose</w:t>
+            </w:r>
+            <w:proofErr w:type="spellEnd"/>
           </w:p>
         </w:tc>
         <w:tc>
@@ -3096,9 +4323,11 @@
             <w:pPr>
               <w:pStyle w:val="TableContents"/>
             </w:pPr>
+            <w:proofErr w:type="spellStart"/>
             <w:r>
               <w:t>Android</w:t>
             </w:r>
+            <w:proofErr w:type="spellEnd"/>
           </w:p>
         </w:tc>
       </w:tr>
@@ -3139,7 +4368,15 @@
               <w:pStyle w:val="TableContents"/>
             </w:pPr>
             <w:r>
-              <w:t>Günlük özet kartları için ViewModel ve veri katmanı</w:t>
+              <w:t xml:space="preserve">Günlük özet kartları için </w:t>
+            </w:r>
+            <w:proofErr w:type="spellStart"/>
+            <w:r>
+              <w:t>ViewModel</w:t>
+            </w:r>
+            <w:proofErr w:type="spellEnd"/>
+            <w:r>
+              <w:t xml:space="preserve"> ve veri katmanı</w:t>
             </w:r>
           </w:p>
         </w:tc>
@@ -3158,9 +4395,11 @@
             <w:pPr>
               <w:pStyle w:val="TableContents"/>
             </w:pPr>
+            <w:proofErr w:type="spellStart"/>
             <w:r>
               <w:t>Android</w:t>
             </w:r>
+            <w:proofErr w:type="spellEnd"/>
           </w:p>
         </w:tc>
       </w:tr>
@@ -3200,8 +4439,13 @@
             <w:pPr>
               <w:pStyle w:val="TableContents"/>
             </w:pPr>
-            <w:r>
-              <w:t>Validasyon mesajları ve anomali uyarı diyalogları</w:t>
+            <w:proofErr w:type="spellStart"/>
+            <w:r>
+              <w:t>Validasyon</w:t>
+            </w:r>
+            <w:proofErr w:type="spellEnd"/>
+            <w:r>
+              <w:t xml:space="preserve"> mesajları ve anomali uyarı diyalogları</w:t>
             </w:r>
           </w:p>
         </w:tc>
@@ -3220,9 +4464,11 @@
             <w:pPr>
               <w:pStyle w:val="TableContents"/>
             </w:pPr>
+            <w:proofErr w:type="spellStart"/>
             <w:r>
               <w:t>Android</w:t>
             </w:r>
+            <w:proofErr w:type="spellEnd"/>
           </w:p>
         </w:tc>
       </w:tr>
@@ -3269,7 +4515,23 @@
               <w:t>Yeni</w:t>
             </w:r>
             <w:r>
-              <w:t>: Arka plan adım simülatörü kontrolü (başlat/durdur butonu, durum göstergesi) – Foreground Service ile arka planda adım üretimi ve API'ye gönderme</w:t>
+              <w:t xml:space="preserve">: Arka plan adım simülatörü kontrolü (başlat/durdur butonu, durum göstergesi) – </w:t>
+            </w:r>
+            <w:proofErr w:type="spellStart"/>
+            <w:r>
+              <w:t>Foreground</w:t>
+            </w:r>
+            <w:proofErr w:type="spellEnd"/>
+            <w:r>
+              <w:t xml:space="preserve"> Service ile arka planda adım üretimi ve </w:t>
+            </w:r>
+            <w:proofErr w:type="spellStart"/>
+            <w:r>
+              <w:t>API'ye</w:t>
+            </w:r>
+            <w:proofErr w:type="spellEnd"/>
+            <w:r>
+              <w:t xml:space="preserve"> gönderme</w:t>
             </w:r>
           </w:p>
         </w:tc>
@@ -3288,9 +4550,11 @@
             <w:pPr>
               <w:pStyle w:val="TableContents"/>
             </w:pPr>
+            <w:proofErr w:type="spellStart"/>
             <w:r>
               <w:t>Android</w:t>
             </w:r>
+            <w:proofErr w:type="spellEnd"/>
           </w:p>
         </w:tc>
       </w:tr>
@@ -3327,7 +4591,39 @@
         <w:t>Seçenek A (Tercih edilen):</w:t>
       </w:r>
       <w:r>
-        <w:t xml:space="preserve"> Backend'de Celery task, belirli aralıklarla kullanıcıya adım ekler. Android sadece başlat/durdur isteği atar.</w:t>
+        <w:t xml:space="preserve"> </w:t>
+      </w:r>
+      <w:proofErr w:type="spellStart"/>
+      <w:r>
+        <w:t>Backend'de</w:t>
+      </w:r>
+      <w:proofErr w:type="spellEnd"/>
+      <w:r>
+        <w:t xml:space="preserve"> </w:t>
+      </w:r>
+      <w:proofErr w:type="spellStart"/>
+      <w:r>
+        <w:t>Celery</w:t>
+      </w:r>
+      <w:proofErr w:type="spellEnd"/>
+      <w:r>
+        <w:t xml:space="preserve"> </w:t>
+      </w:r>
+      <w:proofErr w:type="spellStart"/>
+      <w:r>
+        <w:t>task</w:t>
+      </w:r>
+      <w:proofErr w:type="spellEnd"/>
+      <w:r>
+        <w:t xml:space="preserve">, belirli aralıklarla kullanıcıya adım ekler. </w:t>
+      </w:r>
+      <w:proofErr w:type="spellStart"/>
+      <w:r>
+        <w:t>Android</w:t>
+      </w:r>
+      <w:proofErr w:type="spellEnd"/>
+      <w:r>
+        <w:t xml:space="preserve"> sadece başlat/durdur isteği atar.</w:t>
       </w:r>
     </w:p>
     <w:p>
@@ -3346,11 +4642,43 @@
         <w:t>Seçenek B:</w:t>
       </w:r>
       <w:r>
-        <w:t xml:space="preserve"> Android Foreground Service, cihazda rastgele adım üretir ve API'ye gönderir.</w:t>
+        <w:t xml:space="preserve"> </w:t>
+      </w:r>
+      <w:proofErr w:type="spellStart"/>
+      <w:r>
+        <w:t>Android</w:t>
+      </w:r>
+      <w:proofErr w:type="spellEnd"/>
+      <w:r>
+        <w:t xml:space="preserve"> </w:t>
+      </w:r>
+      <w:proofErr w:type="spellStart"/>
+      <w:r>
+        <w:t>Foreground</w:t>
+      </w:r>
+      <w:proofErr w:type="spellEnd"/>
+      <w:r>
+        <w:t xml:space="preserve"> Service, cihazda rastgele adım üretir ve </w:t>
+      </w:r>
+      <w:proofErr w:type="spellStart"/>
+      <w:r>
+        <w:t>API'ye</w:t>
+      </w:r>
+      <w:proofErr w:type="spellEnd"/>
+      <w:r>
+        <w:t xml:space="preserve"> gönderir.</w:t>
       </w:r>
       <w:r>
         <w:br/>
-        <w:t>Ben planı A seçeneğine göre kurdum, çünkü backend'de simülasyon daha kontrollü olur.</w:t>
+        <w:t xml:space="preserve">Ben planı A seçeneğine göre kurdum, çünkü </w:t>
+      </w:r>
+      <w:proofErr w:type="spellStart"/>
+      <w:r>
+        <w:t>backend'de</w:t>
+      </w:r>
+      <w:proofErr w:type="spellEnd"/>
+      <w:r>
+        <w:t xml:space="preserve"> simülasyon daha kontrollü olur.</w:t>
       </w:r>
     </w:p>
     <w:p>
@@ -3483,7 +4811,23 @@
               <w:pStyle w:val="TableContents"/>
             </w:pPr>
             <w:r>
-              <w:t>Hedef CRUD endpoint'leri, premium kontrolü</w:t>
+              <w:t xml:space="preserve">Hedef CRUD </w:t>
+            </w:r>
+            <w:proofErr w:type="spellStart"/>
+            <w:r>
+              <w:t>endpoint'leri</w:t>
+            </w:r>
+            <w:proofErr w:type="spellEnd"/>
+            <w:r>
+              <w:t xml:space="preserve">, </w:t>
+            </w:r>
+            <w:proofErr w:type="spellStart"/>
+            <w:r>
+              <w:t>premium</w:t>
+            </w:r>
+            <w:proofErr w:type="spellEnd"/>
+            <w:r>
+              <w:t xml:space="preserve"> kontrolü</w:t>
             </w:r>
           </w:p>
         </w:tc>
@@ -3502,9 +4846,11 @@
             <w:pPr>
               <w:pStyle w:val="TableContents"/>
             </w:pPr>
+            <w:proofErr w:type="spellStart"/>
             <w:r>
               <w:t>Backend</w:t>
             </w:r>
+            <w:proofErr w:type="spellEnd"/>
           </w:p>
         </w:tc>
       </w:tr>
@@ -3564,9 +4910,11 @@
             <w:pPr>
               <w:pStyle w:val="TableContents"/>
             </w:pPr>
+            <w:proofErr w:type="spellStart"/>
             <w:r>
               <w:t>Backend</w:t>
             </w:r>
+            <w:proofErr w:type="spellEnd"/>
           </w:p>
         </w:tc>
       </w:tr>
@@ -3606,8 +4954,21 @@
             <w:pPr>
               <w:pStyle w:val="TableContents"/>
             </w:pPr>
-            <w:r>
-              <w:t>Streak takibi (günlük kontrol, esnek streak)</w:t>
+            <w:proofErr w:type="spellStart"/>
+            <w:r>
+              <w:t>Streak</w:t>
+            </w:r>
+            <w:proofErr w:type="spellEnd"/>
+            <w:r>
+              <w:t xml:space="preserve"> takibi (günlük kontrol, esnek </w:t>
+            </w:r>
+            <w:proofErr w:type="spellStart"/>
+            <w:r>
+              <w:t>streak</w:t>
+            </w:r>
+            <w:proofErr w:type="spellEnd"/>
+            <w:r>
+              <w:t>)</w:t>
             </w:r>
           </w:p>
         </w:tc>
@@ -3626,9 +4987,11 @@
             <w:pPr>
               <w:pStyle w:val="TableContents"/>
             </w:pPr>
+            <w:proofErr w:type="spellStart"/>
             <w:r>
               <w:t>Backend</w:t>
             </w:r>
+            <w:proofErr w:type="spellEnd"/>
           </w:p>
         </w:tc>
       </w:tr>
@@ -3688,9 +5051,11 @@
             <w:pPr>
               <w:pStyle w:val="TableContents"/>
             </w:pPr>
+            <w:proofErr w:type="spellStart"/>
             <w:r>
               <w:t>Backend</w:t>
             </w:r>
+            <w:proofErr w:type="spellEnd"/>
           </w:p>
         </w:tc>
       </w:tr>
@@ -3730,30 +5095,38 @@
             <w:pPr>
               <w:pStyle w:val="TableContents"/>
             </w:pPr>
+            <w:proofErr w:type="spellStart"/>
+            <w:proofErr w:type="gramStart"/>
             <w:r>
               <w:rPr>
                 <w:rStyle w:val="SourceText"/>
               </w:rPr>
               <w:t>goals</w:t>
             </w:r>
+            <w:proofErr w:type="spellEnd"/>
+            <w:proofErr w:type="gramEnd"/>
             <w:r>
               <w:t xml:space="preserve">, </w:t>
             </w:r>
+            <w:proofErr w:type="spellStart"/>
             <w:r>
               <w:rPr>
                 <w:rStyle w:val="SourceText"/>
               </w:rPr>
               <w:t>goal_progress</w:t>
             </w:r>
+            <w:proofErr w:type="spellEnd"/>
             <w:r>
               <w:t xml:space="preserve">, </w:t>
             </w:r>
+            <w:proofErr w:type="spellStart"/>
             <w:r>
               <w:rPr>
                 <w:rStyle w:val="SourceText"/>
               </w:rPr>
               <w:t>streaks</w:t>
             </w:r>
+            <w:proofErr w:type="spellEnd"/>
             <w:r>
               <w:t xml:space="preserve"> tabloları</w:t>
             </w:r>
@@ -3774,9 +5147,11 @@
             <w:pPr>
               <w:pStyle w:val="TableContents"/>
             </w:pPr>
+            <w:proofErr w:type="spellStart"/>
             <w:r>
               <w:t>Veritabanı</w:t>
             </w:r>
+            <w:proofErr w:type="spellEnd"/>
           </w:p>
         </w:tc>
       </w:tr>
@@ -3836,9 +5211,11 @@
             <w:pPr>
               <w:pStyle w:val="TableContents"/>
             </w:pPr>
+            <w:proofErr w:type="spellStart"/>
             <w:r>
               <w:t>Android</w:t>
             </w:r>
+            <w:proofErr w:type="spellEnd"/>
           </w:p>
         </w:tc>
       </w:tr>
@@ -3878,8 +5255,13 @@
             <w:pPr>
               <w:pStyle w:val="TableContents"/>
             </w:pPr>
-            <w:r>
-              <w:t>Streak göstergesi, rozet animasyonu</w:t>
+            <w:proofErr w:type="spellStart"/>
+            <w:r>
+              <w:t>Streak</w:t>
+            </w:r>
+            <w:proofErr w:type="spellEnd"/>
+            <w:r>
+              <w:t xml:space="preserve"> göstergesi, rozet animasyonu</w:t>
             </w:r>
           </w:p>
         </w:tc>
@@ -3898,9 +5280,11 @@
             <w:pPr>
               <w:pStyle w:val="TableContents"/>
             </w:pPr>
+            <w:proofErr w:type="spellStart"/>
             <w:r>
               <w:t>Android</w:t>
             </w:r>
+            <w:proofErr w:type="spellEnd"/>
           </w:p>
         </w:tc>
       </w:tr>
@@ -3960,9 +5344,11 @@
             <w:pPr>
               <w:pStyle w:val="TableContents"/>
             </w:pPr>
+            <w:proofErr w:type="spellStart"/>
             <w:r>
               <w:t>Android</w:t>
             </w:r>
+            <w:proofErr w:type="spellEnd"/>
           </w:p>
         </w:tc>
       </w:tr>
@@ -3977,8 +5363,13 @@
         <w:pStyle w:val="Balk3"/>
       </w:pPr>
       <w:r>
-        <w:t>FAZ 5: Analitik, Görselleştirme ve Rapor Export</w:t>
+        <w:t xml:space="preserve">FAZ 5: Analitik, Görselleştirme ve Rapor </w:t>
       </w:r>
+      <w:proofErr w:type="spellStart"/>
+      <w:r>
+        <w:t>Export</w:t>
+      </w:r>
+      <w:proofErr w:type="spellEnd"/>
     </w:p>
     <w:tbl>
       <w:tblPr>
@@ -4097,8 +5488,13 @@
               <w:pStyle w:val="TableContents"/>
             </w:pPr>
             <w:r>
-              <w:t>Haftalık/aylık trend endpoint'leri</w:t>
-            </w:r>
+              <w:t xml:space="preserve">Haftalık/aylık trend </w:t>
+            </w:r>
+            <w:proofErr w:type="spellStart"/>
+            <w:r>
+              <w:t>endpoint'leri</w:t>
+            </w:r>
+            <w:proofErr w:type="spellEnd"/>
           </w:p>
         </w:tc>
         <w:tc>
@@ -4116,9 +5512,11 @@
             <w:pPr>
               <w:pStyle w:val="TableContents"/>
             </w:pPr>
+            <w:proofErr w:type="spellStart"/>
             <w:r>
               <w:t>Backend</w:t>
             </w:r>
+            <w:proofErr w:type="spellEnd"/>
           </w:p>
         </w:tc>
       </w:tr>
@@ -4159,7 +5557,23 @@
               <w:pStyle w:val="TableContents"/>
             </w:pPr>
             <w:r>
-              <w:t>Karşılaştırma endpoint'i (bu hafta vs geçen hafta)</w:t>
+              <w:t xml:space="preserve">Karşılaştırma </w:t>
+            </w:r>
+            <w:proofErr w:type="spellStart"/>
+            <w:r>
+              <w:t>endpoint'i</w:t>
+            </w:r>
+            <w:proofErr w:type="spellEnd"/>
+            <w:r>
+              <w:t xml:space="preserve"> (bu hafta </w:t>
+            </w:r>
+            <w:proofErr w:type="spellStart"/>
+            <w:r>
+              <w:t>vs</w:t>
+            </w:r>
+            <w:proofErr w:type="spellEnd"/>
+            <w:r>
+              <w:t xml:space="preserve"> geçen hafta)</w:t>
             </w:r>
           </w:p>
         </w:tc>
@@ -4178,9 +5592,11 @@
             <w:pPr>
               <w:pStyle w:val="TableContents"/>
             </w:pPr>
+            <w:proofErr w:type="spellStart"/>
             <w:r>
               <w:t>Backend</w:t>
             </w:r>
+            <w:proofErr w:type="spellEnd"/>
           </w:p>
         </w:tc>
       </w:tr>
@@ -4240,9 +5656,11 @@
             <w:pPr>
               <w:pStyle w:val="TableContents"/>
             </w:pPr>
+            <w:proofErr w:type="spellStart"/>
             <w:r>
               <w:t>Backend</w:t>
             </w:r>
+            <w:proofErr w:type="spellEnd"/>
           </w:p>
         </w:tc>
       </w:tr>
@@ -4302,9 +5720,11 @@
             <w:pPr>
               <w:pStyle w:val="TableContents"/>
             </w:pPr>
+            <w:proofErr w:type="spellStart"/>
             <w:r>
               <w:t>Backend</w:t>
             </w:r>
+            <w:proofErr w:type="spellEnd"/>
           </w:p>
         </w:tc>
       </w:tr>
@@ -4345,7 +5765,15 @@
               <w:pStyle w:val="TableContents"/>
             </w:pPr>
             <w:r>
-              <w:t>Dashboard özet endpoint'i (tek istekte tüm veriler)</w:t>
+              <w:t xml:space="preserve">Dashboard özet </w:t>
+            </w:r>
+            <w:proofErr w:type="spellStart"/>
+            <w:r>
+              <w:t>endpoint'i</w:t>
+            </w:r>
+            <w:proofErr w:type="spellEnd"/>
+            <w:r>
+              <w:t xml:space="preserve"> (tek istekte tüm veriler)</w:t>
             </w:r>
           </w:p>
         </w:tc>
@@ -4364,9 +5792,11 @@
             <w:pPr>
               <w:pStyle w:val="TableContents"/>
             </w:pPr>
+            <w:proofErr w:type="spellStart"/>
             <w:r>
               <w:t>Backend</w:t>
             </w:r>
+            <w:proofErr w:type="spellEnd"/>
           </w:p>
         </w:tc>
       </w:tr>
@@ -4413,26 +5843,101 @@
               <w:t>Yeni</w:t>
             </w:r>
             <w:r>
-              <w:t>: Rapor export endpoint'i (</w:t>
+              <w:t xml:space="preserve">: Rapor </w:t>
+            </w:r>
+            <w:proofErr w:type="spellStart"/>
+            <w:r>
+              <w:t>export</w:t>
+            </w:r>
+            <w:proofErr w:type="spellEnd"/>
+            <w:r>
+              <w:t xml:space="preserve"> </w:t>
+            </w:r>
+            <w:proofErr w:type="spellStart"/>
+            <w:r>
+              <w:t>endpoint'i</w:t>
+            </w:r>
+            <w:proofErr w:type="spellEnd"/>
+            <w:r>
+              <w:t xml:space="preserve"> (</w:t>
             </w:r>
             <w:r>
               <w:rPr>
                 <w:rStyle w:val="SourceText"/>
               </w:rPr>
-              <w:t>GET /report?period=weekly&amp;format=pdf</w:t>
-            </w:r>
+              <w:t>GET /</w:t>
+            </w:r>
+            <w:proofErr w:type="spellStart"/>
+            <w:r>
+              <w:rPr>
+                <w:rStyle w:val="SourceText"/>
+              </w:rPr>
+              <w:t>report?period</w:t>
+            </w:r>
+            <w:proofErr w:type="spellEnd"/>
+            <w:r>
+              <w:rPr>
+                <w:rStyle w:val="SourceText"/>
+              </w:rPr>
+              <w:t>=</w:t>
+            </w:r>
+            <w:proofErr w:type="spellStart"/>
+            <w:r>
+              <w:rPr>
+                <w:rStyle w:val="SourceText"/>
+              </w:rPr>
+              <w:t>weekly&amp;format</w:t>
+            </w:r>
+            <w:proofErr w:type="spellEnd"/>
+            <w:r>
+              <w:rPr>
+                <w:rStyle w:val="SourceText"/>
+              </w:rPr>
+              <w:t>=</w:t>
+            </w:r>
+            <w:proofErr w:type="spellStart"/>
+            <w:r>
+              <w:rPr>
+                <w:rStyle w:val="SourceText"/>
+              </w:rPr>
+              <w:t>pdf</w:t>
+            </w:r>
+            <w:proofErr w:type="spellEnd"/>
             <w:r>
               <w:t xml:space="preserve"> veya </w:t>
             </w:r>
+            <w:proofErr w:type="spellStart"/>
             <w:r>
               <w:rPr>
                 <w:rStyle w:val="SourceText"/>
               </w:rPr>
               <w:t>csv</w:t>
             </w:r>
-            <w:r>
-              <w:t>) – PDF için ReportLab/WeasyPrint, CSV için basit writer</w:t>
-            </w:r>
+            <w:proofErr w:type="spellEnd"/>
+            <w:r>
+              <w:t xml:space="preserve">) – PDF için </w:t>
+            </w:r>
+            <w:proofErr w:type="spellStart"/>
+            <w:r>
+              <w:t>ReportLab</w:t>
+            </w:r>
+            <w:proofErr w:type="spellEnd"/>
+            <w:r>
+              <w:t>/</w:t>
+            </w:r>
+            <w:proofErr w:type="spellStart"/>
+            <w:r>
+              <w:t>WeasyPrint</w:t>
+            </w:r>
+            <w:proofErr w:type="spellEnd"/>
+            <w:r>
+              <w:t xml:space="preserve">, CSV için basit </w:t>
+            </w:r>
+            <w:proofErr w:type="spellStart"/>
+            <w:r>
+              <w:t>writer</w:t>
+            </w:r>
+            <w:proofErr w:type="spellEnd"/>
           </w:p>
         </w:tc>
         <w:tc>
@@ -4450,9 +5955,11 @@
             <w:pPr>
               <w:pStyle w:val="TableContents"/>
             </w:pPr>
+            <w:proofErr w:type="spellStart"/>
             <w:r>
               <w:t>Backend</w:t>
             </w:r>
+            <w:proofErr w:type="spellEnd"/>
           </w:p>
         </w:tc>
       </w:tr>
@@ -4495,12 +6002,14 @@
             <w:r>
               <w:t xml:space="preserve">Sorgu optimizasyonu, </w:t>
             </w:r>
+            <w:proofErr w:type="spellStart"/>
             <w:r>
               <w:rPr>
                 <w:rStyle w:val="SourceText"/>
               </w:rPr>
               <w:t>daily_summary</w:t>
             </w:r>
+            <w:proofErr w:type="spellEnd"/>
             <w:r>
               <w:t xml:space="preserve"> tablosundan okuma</w:t>
             </w:r>
@@ -4521,9 +6030,11 @@
             <w:pPr>
               <w:pStyle w:val="TableContents"/>
             </w:pPr>
+            <w:proofErr w:type="spellStart"/>
             <w:r>
               <w:t>Veritabanı</w:t>
             </w:r>
+            <w:proofErr w:type="spellEnd"/>
           </w:p>
         </w:tc>
       </w:tr>
@@ -4564,7 +6075,15 @@
               <w:pStyle w:val="TableContents"/>
             </w:pPr>
             <w:r>
-              <w:t>Dashboard ana sayfa tasarımı (kartlar, progress barlar)</w:t>
+              <w:t xml:space="preserve">Dashboard ana sayfa tasarımı (kartlar, </w:t>
+            </w:r>
+            <w:proofErr w:type="spellStart"/>
+            <w:r>
+              <w:t>progress</w:t>
+            </w:r>
+            <w:proofErr w:type="spellEnd"/>
+            <w:r>
+              <w:t xml:space="preserve"> barlar)</w:t>
             </w:r>
           </w:p>
         </w:tc>
@@ -4583,9 +6102,11 @@
             <w:pPr>
               <w:pStyle w:val="TableContents"/>
             </w:pPr>
+            <w:proofErr w:type="spellStart"/>
             <w:r>
               <w:t>Android</w:t>
             </w:r>
+            <w:proofErr w:type="spellEnd"/>
           </w:p>
         </w:tc>
       </w:tr>
@@ -4626,7 +6147,39 @@
               <w:pStyle w:val="TableContents"/>
             </w:pPr>
             <w:r>
-              <w:t>Grafik bileşenleri (MPAndroidChart: LineChart, BarChart, PieChart)</w:t>
+              <w:t>Grafik bileşenleri (</w:t>
+            </w:r>
+            <w:proofErr w:type="spellStart"/>
+            <w:r>
+              <w:t>MPAndroidChart</w:t>
+            </w:r>
+            <w:proofErr w:type="spellEnd"/>
+            <w:r>
+              <w:t xml:space="preserve">: </w:t>
+            </w:r>
+            <w:proofErr w:type="spellStart"/>
+            <w:r>
+              <w:t>LineChart</w:t>
+            </w:r>
+            <w:proofErr w:type="spellEnd"/>
+            <w:r>
+              <w:t xml:space="preserve">, </w:t>
+            </w:r>
+            <w:proofErr w:type="spellStart"/>
+            <w:r>
+              <w:t>BarChart</w:t>
+            </w:r>
+            <w:proofErr w:type="spellEnd"/>
+            <w:r>
+              <w:t xml:space="preserve">, </w:t>
+            </w:r>
+            <w:proofErr w:type="spellStart"/>
+            <w:r>
+              <w:t>PieChart</w:t>
+            </w:r>
+            <w:proofErr w:type="spellEnd"/>
+            <w:r>
+              <w:t>)</w:t>
             </w:r>
           </w:p>
         </w:tc>
@@ -4645,9 +6198,11 @@
             <w:pPr>
               <w:pStyle w:val="TableContents"/>
             </w:pPr>
+            <w:proofErr w:type="spellStart"/>
             <w:r>
               <w:t>Android</w:t>
             </w:r>
+            <w:proofErr w:type="spellEnd"/>
           </w:p>
         </w:tc>
       </w:tr>
@@ -4707,9 +6262,11 @@
             <w:pPr>
               <w:pStyle w:val="TableContents"/>
             </w:pPr>
+            <w:proofErr w:type="spellStart"/>
             <w:r>
               <w:t>Android</w:t>
             </w:r>
+            <w:proofErr w:type="spellEnd"/>
           </w:p>
         </w:tc>
       </w:tr>
@@ -4769,9 +6326,11 @@
             <w:pPr>
               <w:pStyle w:val="TableContents"/>
             </w:pPr>
+            <w:proofErr w:type="spellStart"/>
             <w:r>
               <w:t>Android</w:t>
             </w:r>
+            <w:proofErr w:type="spellEnd"/>
           </w:p>
         </w:tc>
       </w:tr>
@@ -4818,7 +6377,15 @@
               <w:t>Yeni</w:t>
             </w:r>
             <w:r>
-              <w:t>: Rapor indirme arayüzü (periyot seçimi, PDF/CSV butonu, indirme yöneticisi)</w:t>
+              <w:t xml:space="preserve">: Rapor indirme </w:t>
+            </w:r>
+            <w:proofErr w:type="spellStart"/>
+            <w:r>
+              <w:t>arayüzü</w:t>
+            </w:r>
+            <w:proofErr w:type="spellEnd"/>
+            <w:r>
+              <w:t xml:space="preserve"> (periyot seçimi, PDF/CSV butonu, indirme yöneticisi)</w:t>
             </w:r>
           </w:p>
         </w:tc>
@@ -4837,9 +6404,11 @@
             <w:pPr>
               <w:pStyle w:val="TableContents"/>
             </w:pPr>
+            <w:proofErr w:type="spellStart"/>
             <w:r>
               <w:t>Android</w:t>
             </w:r>
+            <w:proofErr w:type="spellEnd"/>
           </w:p>
         </w:tc>
       </w:tr>
@@ -4993,9 +6562,11 @@
             <w:pPr>
               <w:pStyle w:val="TableContents"/>
             </w:pPr>
+            <w:proofErr w:type="spellStart"/>
             <w:r>
               <w:t>Backend</w:t>
             </w:r>
+            <w:proofErr w:type="spellEnd"/>
           </w:p>
         </w:tc>
       </w:tr>
@@ -5055,9 +6626,11 @@
             <w:pPr>
               <w:pStyle w:val="TableContents"/>
             </w:pPr>
+            <w:proofErr w:type="spellStart"/>
             <w:r>
               <w:t>Backend</w:t>
             </w:r>
+            <w:proofErr w:type="spellEnd"/>
           </w:p>
         </w:tc>
       </w:tr>
@@ -5097,15 +6670,24 @@
             <w:pPr>
               <w:pStyle w:val="TableContents"/>
             </w:pPr>
+            <w:proofErr w:type="spellStart"/>
+            <w:proofErr w:type="gramStart"/>
             <w:r>
               <w:rPr>
                 <w:rStyle w:val="SourceText"/>
               </w:rPr>
               <w:t>notifications</w:t>
             </w:r>
-            <w:r>
-              <w:t xml:space="preserve"> tablosu ve REST endpoint'leri</w:t>
-            </w:r>
+            <w:proofErr w:type="spellEnd"/>
+            <w:proofErr w:type="gramEnd"/>
+            <w:r>
+              <w:t xml:space="preserve"> tablosu ve REST </w:t>
+            </w:r>
+            <w:proofErr w:type="spellStart"/>
+            <w:r>
+              <w:t>endpoint'leri</w:t>
+            </w:r>
+            <w:proofErr w:type="spellEnd"/>
           </w:p>
         </w:tc>
         <w:tc>
@@ -5123,9 +6705,11 @@
             <w:pPr>
               <w:pStyle w:val="TableContents"/>
             </w:pPr>
+            <w:proofErr w:type="spellStart"/>
             <w:r>
               <w:t>Veritabanı</w:t>
             </w:r>
+            <w:proofErr w:type="spellEnd"/>
           </w:p>
         </w:tc>
       </w:tr>
@@ -5166,8 +6750,45 @@
             <w:pPr>
               <w:pStyle w:val="TableContents"/>
             </w:pPr>
-            <w:r>
-              <w:t>Android notification channel tanımları, FCM entegrasyonu (simülasyon için local notification)</w:t>
+            <w:proofErr w:type="spellStart"/>
+            <w:r>
+              <w:t>Android</w:t>
+            </w:r>
+            <w:proofErr w:type="spellEnd"/>
+            <w:r>
+              <w:t xml:space="preserve"> </w:t>
+            </w:r>
+            <w:proofErr w:type="spellStart"/>
+            <w:r>
+              <w:t>notification</w:t>
+            </w:r>
+            <w:proofErr w:type="spellEnd"/>
+            <w:r>
+              <w:t xml:space="preserve"> </w:t>
+            </w:r>
+            <w:proofErr w:type="spellStart"/>
+            <w:r>
+              <w:t>channel</w:t>
+            </w:r>
+            <w:proofErr w:type="spellEnd"/>
+            <w:r>
+              <w:t xml:space="preserve"> tanımları, FCM entegrasyonu (simülasyon için </w:t>
+            </w:r>
+            <w:proofErr w:type="spellStart"/>
+            <w:r>
+              <w:t>local</w:t>
+            </w:r>
+            <w:proofErr w:type="spellEnd"/>
+            <w:r>
+              <w:t xml:space="preserve"> </w:t>
+            </w:r>
+            <w:proofErr w:type="spellStart"/>
+            <w:r>
+              <w:t>notification</w:t>
+            </w:r>
+            <w:proofErr w:type="spellEnd"/>
+            <w:r>
+              <w:t>)</w:t>
             </w:r>
           </w:p>
         </w:tc>
@@ -5186,9 +6807,11 @@
             <w:pPr>
               <w:pStyle w:val="TableContents"/>
             </w:pPr>
+            <w:proofErr w:type="spellStart"/>
             <w:r>
               <w:t>Android</w:t>
             </w:r>
+            <w:proofErr w:type="spellEnd"/>
           </w:p>
         </w:tc>
       </w:tr>
@@ -5228,9 +6851,19 @@
             <w:pPr>
               <w:pStyle w:val="TableContents"/>
             </w:pPr>
-            <w:r>
-              <w:t>In-app bildirim listesi ve badge</w:t>
-            </w:r>
+            <w:proofErr w:type="spellStart"/>
+            <w:r>
+              <w:t>In-app</w:t>
+            </w:r>
+            <w:proofErr w:type="spellEnd"/>
+            <w:r>
+              <w:t xml:space="preserve"> bildirim listesi ve </w:t>
+            </w:r>
+            <w:proofErr w:type="spellStart"/>
+            <w:r>
+              <w:t>badge</w:t>
+            </w:r>
+            <w:proofErr w:type="spellEnd"/>
           </w:p>
         </w:tc>
         <w:tc>
@@ -5248,9 +6881,11 @@
             <w:pPr>
               <w:pStyle w:val="TableContents"/>
             </w:pPr>
+            <w:proofErr w:type="spellStart"/>
             <w:r>
               <w:t>Android</w:t>
             </w:r>
+            <w:proofErr w:type="spellEnd"/>
           </w:p>
         </w:tc>
       </w:tr>
@@ -5310,9 +6945,11 @@
             <w:pPr>
               <w:pStyle w:val="TableContents"/>
             </w:pPr>
+            <w:proofErr w:type="spellStart"/>
             <w:r>
               <w:t>Android</w:t>
             </w:r>
+            <w:proofErr w:type="spellEnd"/>
           </w:p>
         </w:tc>
       </w:tr>
@@ -5446,8 +7083,29 @@
             <w:pPr>
               <w:pStyle w:val="TableContents"/>
             </w:pPr>
-            <w:r>
-              <w:t>OpenAI/LLM istemcisi (FastAPI, httpx)</w:t>
+            <w:proofErr w:type="spellStart"/>
+            <w:r>
+              <w:t>OpenAI</w:t>
+            </w:r>
+            <w:proofErr w:type="spellEnd"/>
+            <w:r>
+              <w:t>/LLM istemcisi (</w:t>
+            </w:r>
+            <w:proofErr w:type="spellStart"/>
+            <w:r>
+              <w:t>FastAPI</w:t>
+            </w:r>
+            <w:proofErr w:type="spellEnd"/>
+            <w:r>
+              <w:t xml:space="preserve">, </w:t>
+            </w:r>
+            <w:proofErr w:type="spellStart"/>
+            <w:r>
+              <w:t>httpx</w:t>
+            </w:r>
+            <w:proofErr w:type="spellEnd"/>
+            <w:r>
+              <w:t>)</w:t>
             </w:r>
           </w:p>
         </w:tc>
@@ -5466,9 +7124,11 @@
             <w:pPr>
               <w:pStyle w:val="TableContents"/>
             </w:pPr>
+            <w:proofErr w:type="spellStart"/>
             <w:r>
               <w:t>Backend</w:t>
             </w:r>
+            <w:proofErr w:type="spellEnd"/>
           </w:p>
         </w:tc>
       </w:tr>
@@ -5509,7 +7169,15 @@
               <w:pStyle w:val="TableContents"/>
             </w:pPr>
             <w:r>
-              <w:t>Sistem prompt ve veri ön işleme (kullanıcı özeti)</w:t>
+              <w:t xml:space="preserve">Sistem </w:t>
+            </w:r>
+            <w:proofErr w:type="spellStart"/>
+            <w:r>
+              <w:t>prompt</w:t>
+            </w:r>
+            <w:proofErr w:type="spellEnd"/>
+            <w:r>
+              <w:t xml:space="preserve"> ve veri ön işleme (kullanıcı özeti)</w:t>
             </w:r>
           </w:p>
         </w:tc>
@@ -5528,9 +7196,11 @@
             <w:pPr>
               <w:pStyle w:val="TableContents"/>
             </w:pPr>
+            <w:proofErr w:type="spellStart"/>
             <w:r>
               <w:t>Backend</w:t>
             </w:r>
+            <w:proofErr w:type="spellEnd"/>
           </w:p>
         </w:tc>
       </w:tr>
@@ -5571,14 +7241,52 @@
               <w:pStyle w:val="TableContents"/>
             </w:pPr>
             <w:r>
-              <w:t>SSE streaming endpoint'i (</w:t>
+              <w:t xml:space="preserve">SSE </w:t>
+            </w:r>
+            <w:proofErr w:type="spellStart"/>
+            <w:r>
+              <w:t>streaming</w:t>
+            </w:r>
+            <w:proofErr w:type="spellEnd"/>
+            <w:r>
+              <w:t xml:space="preserve"> </w:t>
+            </w:r>
+            <w:proofErr w:type="spellStart"/>
+            <w:r>
+              <w:t>endpoint'i</w:t>
+            </w:r>
+            <w:proofErr w:type="spellEnd"/>
+            <w:r>
+              <w:t xml:space="preserve"> (</w:t>
             </w:r>
             <w:r>
               <w:rPr>
                 <w:rStyle w:val="SourceText"/>
               </w:rPr>
-              <w:t>GET /chat/stream</w:t>
-            </w:r>
+              <w:t>GET /</w:t>
+            </w:r>
+            <w:proofErr w:type="spellStart"/>
+            <w:r>
+              <w:rPr>
+                <w:rStyle w:val="SourceText"/>
+              </w:rPr>
+              <w:t>chat</w:t>
+            </w:r>
+            <w:proofErr w:type="spellEnd"/>
+            <w:r>
+              <w:rPr>
+                <w:rStyle w:val="SourceText"/>
+              </w:rPr>
+              <w:t>/</w:t>
+            </w:r>
+            <w:proofErr w:type="spellStart"/>
+            <w:r>
+              <w:rPr>
+                <w:rStyle w:val="SourceText"/>
+              </w:rPr>
+              <w:t>stream</w:t>
+            </w:r>
+            <w:proofErr w:type="spellEnd"/>
             <w:r>
               <w:t>)</w:t>
             </w:r>
@@ -5599,9 +7307,11 @@
             <w:pPr>
               <w:pStyle w:val="TableContents"/>
             </w:pPr>
+            <w:proofErr w:type="spellStart"/>
             <w:r>
               <w:t>Backend</w:t>
             </w:r>
+            <w:proofErr w:type="spellEnd"/>
           </w:p>
         </w:tc>
       </w:tr>
@@ -5642,8 +7352,13 @@
               <w:pStyle w:val="TableContents"/>
             </w:pPr>
             <w:r>
-              <w:t>Chat geçmişi Redis'te</w:t>
-            </w:r>
+              <w:t xml:space="preserve">Chat geçmişi </w:t>
+            </w:r>
+            <w:proofErr w:type="spellStart"/>
+            <w:r>
+              <w:t>Redis'te</w:t>
+            </w:r>
+            <w:proofErr w:type="spellEnd"/>
           </w:p>
         </w:tc>
         <w:tc>
@@ -5661,9 +7376,11 @@
             <w:pPr>
               <w:pStyle w:val="TableContents"/>
             </w:pPr>
+            <w:proofErr w:type="spellStart"/>
             <w:r>
               <w:t>Veritabanı</w:t>
             </w:r>
+            <w:proofErr w:type="spellEnd"/>
           </w:p>
         </w:tc>
       </w:tr>
@@ -5704,7 +7421,31 @@
               <w:pStyle w:val="TableContents"/>
             </w:pPr>
             <w:r>
-              <w:t>Chat arayüzü (Compose, LazyColumn, mesaj baloncukları, yazma animasyonu)</w:t>
+              <w:t xml:space="preserve">Chat </w:t>
+            </w:r>
+            <w:proofErr w:type="spellStart"/>
+            <w:r>
+              <w:t>arayüzü</w:t>
+            </w:r>
+            <w:proofErr w:type="spellEnd"/>
+            <w:r>
+              <w:t xml:space="preserve"> (</w:t>
+            </w:r>
+            <w:proofErr w:type="spellStart"/>
+            <w:r>
+              <w:t>Compose</w:t>
+            </w:r>
+            <w:proofErr w:type="spellEnd"/>
+            <w:r>
+              <w:t xml:space="preserve">, </w:t>
+            </w:r>
+            <w:proofErr w:type="spellStart"/>
+            <w:r>
+              <w:t>LazyColumn</w:t>
+            </w:r>
+            <w:proofErr w:type="spellEnd"/>
+            <w:r>
+              <w:t>, mesaj baloncukları, yazma animasyonu)</w:t>
             </w:r>
           </w:p>
         </w:tc>
@@ -5723,9 +7464,11 @@
             <w:pPr>
               <w:pStyle w:val="TableContents"/>
             </w:pPr>
+            <w:proofErr w:type="spellStart"/>
             <w:r>
               <w:t>Android</w:t>
             </w:r>
+            <w:proofErr w:type="spellEnd"/>
           </w:p>
         </w:tc>
       </w:tr>
@@ -5785,9 +7528,11 @@
             <w:pPr>
               <w:pStyle w:val="TableContents"/>
             </w:pPr>
+            <w:proofErr w:type="spellStart"/>
             <w:r>
               <w:t>Android</w:t>
             </w:r>
+            <w:proofErr w:type="spellEnd"/>
           </w:p>
         </w:tc>
       </w:tr>
@@ -5847,9 +7592,11 @@
             <w:pPr>
               <w:pStyle w:val="TableContents"/>
             </w:pPr>
+            <w:proofErr w:type="spellStart"/>
             <w:r>
               <w:t>Android</w:t>
             </w:r>
+            <w:proofErr w:type="spellEnd"/>
           </w:p>
         </w:tc>
       </w:tr>
@@ -5984,7 +7731,31 @@
               <w:pStyle w:val="TableContents"/>
             </w:pPr>
             <w:r>
-              <w:t>Apple Health / Google Fit okuma (Health Connect API – Android'de)</w:t>
+              <w:t xml:space="preserve">Apple </w:t>
+            </w:r>
+            <w:proofErr w:type="spellStart"/>
+            <w:r>
+              <w:t>Health</w:t>
+            </w:r>
+            <w:proofErr w:type="spellEnd"/>
+            <w:r>
+              <w:t xml:space="preserve"> / Google Fit okuma (</w:t>
+            </w:r>
+            <w:proofErr w:type="spellStart"/>
+            <w:r>
+              <w:t>Health</w:t>
+            </w:r>
+            <w:proofErr w:type="spellEnd"/>
+            <w:r>
+              <w:t xml:space="preserve"> Connect API – </w:t>
+            </w:r>
+            <w:proofErr w:type="spellStart"/>
+            <w:r>
+              <w:t>Android'de</w:t>
+            </w:r>
+            <w:proofErr w:type="spellEnd"/>
+            <w:r>
+              <w:t>)</w:t>
             </w:r>
           </w:p>
         </w:tc>
@@ -6003,8 +7774,21 @@
             <w:pPr>
               <w:pStyle w:val="TableContents"/>
             </w:pPr>
-            <w:r>
-              <w:t>Backend (API) / Android (izinler ve veri gönderme)</w:t>
+            <w:proofErr w:type="spellStart"/>
+            <w:r>
+              <w:t>Backend</w:t>
+            </w:r>
+            <w:proofErr w:type="spellEnd"/>
+            <w:r>
+              <w:t xml:space="preserve"> (API) / </w:t>
+            </w:r>
+            <w:proofErr w:type="spellStart"/>
+            <w:r>
+              <w:t>Android</w:t>
+            </w:r>
+            <w:proofErr w:type="spellEnd"/>
+            <w:r>
+              <w:t xml:space="preserve"> (izinler ve veri gönderme)</w:t>
             </w:r>
           </w:p>
         </w:tc>
@@ -6065,9 +7849,11 @@
             <w:pPr>
               <w:pStyle w:val="TableContents"/>
             </w:pPr>
+            <w:proofErr w:type="spellStart"/>
             <w:r>
               <w:t>Backend</w:t>
             </w:r>
+            <w:proofErr w:type="spellEnd"/>
           </w:p>
         </w:tc>
       </w:tr>
@@ -6107,8 +7893,29 @@
             <w:pPr>
               <w:pStyle w:val="TableContents"/>
             </w:pPr>
-            <w:r>
-              <w:t>WebSocket sunucusu (FastAPI WebSocket) – sanal saat için</w:t>
+            <w:proofErr w:type="spellStart"/>
+            <w:r>
+              <w:t>WebSocket</w:t>
+            </w:r>
+            <w:proofErr w:type="spellEnd"/>
+            <w:r>
+              <w:t xml:space="preserve"> sunucusu (</w:t>
+            </w:r>
+            <w:proofErr w:type="spellStart"/>
+            <w:r>
+              <w:t>FastAPI</w:t>
+            </w:r>
+            <w:proofErr w:type="spellEnd"/>
+            <w:r>
+              <w:t xml:space="preserve"> </w:t>
+            </w:r>
+            <w:proofErr w:type="spellStart"/>
+            <w:r>
+              <w:t>WebSocket</w:t>
+            </w:r>
+            <w:proofErr w:type="spellEnd"/>
+            <w:r>
+              <w:t>) – sanal saat için</w:t>
             </w:r>
           </w:p>
         </w:tc>
@@ -6127,9 +7934,11 @@
             <w:pPr>
               <w:pStyle w:val="TableContents"/>
             </w:pPr>
+            <w:proofErr w:type="spellStart"/>
             <w:r>
               <w:t>Backend</w:t>
             </w:r>
+            <w:proofErr w:type="spellEnd"/>
           </w:p>
         </w:tc>
       </w:tr>
@@ -6170,7 +7979,23 @@
               <w:pStyle w:val="TableContents"/>
             </w:pPr>
             <w:r>
-              <w:t>Sanal saat Python script'i (her saniye veri üretir)</w:t>
+              <w:t xml:space="preserve">Sanal saat </w:t>
+            </w:r>
+            <w:proofErr w:type="spellStart"/>
+            <w:r>
+              <w:t>Python</w:t>
+            </w:r>
+            <w:proofErr w:type="spellEnd"/>
+            <w:r>
+              <w:t xml:space="preserve"> </w:t>
+            </w:r>
+            <w:proofErr w:type="spellStart"/>
+            <w:r>
+              <w:t>script'i</w:t>
+            </w:r>
+            <w:proofErr w:type="spellEnd"/>
+            <w:r>
+              <w:t xml:space="preserve"> (her saniye veri üretir)</w:t>
             </w:r>
           </w:p>
         </w:tc>
@@ -6189,9 +8014,11 @@
             <w:pPr>
               <w:pStyle w:val="TableContents"/>
             </w:pPr>
+            <w:proofErr w:type="spellStart"/>
             <w:r>
               <w:t>Veritabanı</w:t>
             </w:r>
+            <w:proofErr w:type="spellEnd"/>
           </w:p>
         </w:tc>
       </w:tr>
@@ -6232,7 +8059,15 @@
               <w:pStyle w:val="TableContents"/>
             </w:pPr>
             <w:r>
-              <w:t>Anlık veriyi batch insert ile kaydetme</w:t>
+              <w:t xml:space="preserve">Anlık veriyi </w:t>
+            </w:r>
+            <w:proofErr w:type="spellStart"/>
+            <w:r>
+              <w:t>batch</w:t>
+            </w:r>
+            <w:proofErr w:type="spellEnd"/>
+            <w:r>
+              <w:t xml:space="preserve"> insert ile kaydetme</w:t>
             </w:r>
           </w:p>
         </w:tc>
@@ -6251,9 +8086,11 @@
             <w:pPr>
               <w:pStyle w:val="TableContents"/>
             </w:pPr>
+            <w:proofErr w:type="spellStart"/>
             <w:r>
               <w:t>Veritabanı</w:t>
             </w:r>
+            <w:proofErr w:type="spellEnd"/>
           </w:p>
         </w:tc>
       </w:tr>
@@ -6293,8 +8130,21 @@
             <w:pPr>
               <w:pStyle w:val="TableContents"/>
             </w:pPr>
-            <w:r>
-              <w:t>Android Health Connect izin ekranı ve senkronizasyon</w:t>
+            <w:proofErr w:type="spellStart"/>
+            <w:r>
+              <w:t>Android</w:t>
+            </w:r>
+            <w:proofErr w:type="spellEnd"/>
+            <w:r>
+              <w:t xml:space="preserve"> </w:t>
+            </w:r>
+            <w:proofErr w:type="spellStart"/>
+            <w:r>
+              <w:t>Health</w:t>
+            </w:r>
+            <w:proofErr w:type="spellEnd"/>
+            <w:r>
+              <w:t xml:space="preserve"> Connect izin ekranı ve senkronizasyon</w:t>
             </w:r>
           </w:p>
         </w:tc>
@@ -6313,9 +8163,11 @@
             <w:pPr>
               <w:pStyle w:val="TableContents"/>
             </w:pPr>
+            <w:proofErr w:type="spellStart"/>
             <w:r>
               <w:t>Android</w:t>
             </w:r>
+            <w:proofErr w:type="spellEnd"/>
           </w:p>
         </w:tc>
       </w:tr>
@@ -6356,7 +8208,15 @@
               <w:pStyle w:val="TableContents"/>
             </w:pPr>
             <w:r>
-              <w:t>Canlı kalp atış hızı kartı (WebSocket, mini grafik)</w:t>
+              <w:t>Canlı kalp atış hızı kartı (</w:t>
+            </w:r>
+            <w:proofErr w:type="spellStart"/>
+            <w:r>
+              <w:t>WebSocket</w:t>
+            </w:r>
+            <w:proofErr w:type="spellEnd"/>
+            <w:r>
+              <w:t>, mini grafik)</w:t>
             </w:r>
           </w:p>
         </w:tc>
@@ -6375,9 +8235,11 @@
             <w:pPr>
               <w:pStyle w:val="TableContents"/>
             </w:pPr>
+            <w:proofErr w:type="spellStart"/>
             <w:r>
               <w:t>Android</w:t>
             </w:r>
+            <w:proofErr w:type="spellEnd"/>
           </w:p>
         </w:tc>
       </w:tr>
@@ -6392,7 +8254,15 @@
         <w:pStyle w:val="Balk3"/>
       </w:pPr>
       <w:r>
-        <w:t>FAZ 9: Gamification – Puan, Sıralama, Rozetler ve Arkadaş Karşılaştırma</w:t>
+        <w:t xml:space="preserve">FAZ 9: </w:t>
+      </w:r>
+      <w:proofErr w:type="spellStart"/>
+      <w:r>
+        <w:t>Gamification</w:t>
+      </w:r>
+      <w:proofErr w:type="spellEnd"/>
+      <w:r>
+        <w:t xml:space="preserve"> – Puan, Sıralama, Rozetler ve Arkadaş Karşılaştırma</w:t>
       </w:r>
     </w:p>
     <w:tbl>
@@ -6531,9 +8401,11 @@
             <w:pPr>
               <w:pStyle w:val="TableContents"/>
             </w:pPr>
+            <w:proofErr w:type="spellStart"/>
             <w:r>
               <w:t>Veritabanı</w:t>
             </w:r>
+            <w:proofErr w:type="spellEnd"/>
           </w:p>
         </w:tc>
       </w:tr>
@@ -6574,7 +8446,23 @@
               <w:pStyle w:val="TableContents"/>
             </w:pPr>
             <w:r>
-              <w:t>Haftalık puan hesaplama (Celery job, ağırlıklı skor)</w:t>
+              <w:t>Haftalık puan hesaplama (</w:t>
+            </w:r>
+            <w:proofErr w:type="spellStart"/>
+            <w:r>
+              <w:t>Celery</w:t>
+            </w:r>
+            <w:proofErr w:type="spellEnd"/>
+            <w:r>
+              <w:t xml:space="preserve"> </w:t>
+            </w:r>
+            <w:proofErr w:type="spellStart"/>
+            <w:r>
+              <w:t>job</w:t>
+            </w:r>
+            <w:proofErr w:type="spellEnd"/>
+            <w:r>
+              <w:t>, ağırlıklı skor)</w:t>
             </w:r>
           </w:p>
         </w:tc>
@@ -6593,9 +8481,11 @@
             <w:pPr>
               <w:pStyle w:val="TableContents"/>
             </w:pPr>
+            <w:proofErr w:type="spellStart"/>
             <w:r>
               <w:t>Backend</w:t>
             </w:r>
+            <w:proofErr w:type="spellEnd"/>
           </w:p>
         </w:tc>
       </w:tr>
@@ -6635,8 +8525,21 @@
             <w:pPr>
               <w:pStyle w:val="TableContents"/>
             </w:pPr>
-            <w:r>
-              <w:t>Redis Sorted Set ile anonim sıralama</w:t>
+            <w:proofErr w:type="spellStart"/>
+            <w:r>
+              <w:t>Redis</w:t>
+            </w:r>
+            <w:proofErr w:type="spellEnd"/>
+            <w:r>
+              <w:t xml:space="preserve"> </w:t>
+            </w:r>
+            <w:proofErr w:type="spellStart"/>
+            <w:r>
+              <w:t>Sorted</w:t>
+            </w:r>
+            <w:proofErr w:type="spellEnd"/>
+            <w:r>
+              <w:t xml:space="preserve"> Set ile anonim sıralama</w:t>
             </w:r>
           </w:p>
         </w:tc>
@@ -6655,9 +8558,11 @@
             <w:pPr>
               <w:pStyle w:val="TableContents"/>
             </w:pPr>
+            <w:proofErr w:type="spellStart"/>
             <w:r>
               <w:t>Veritabanı</w:t>
             </w:r>
+            <w:proofErr w:type="spellEnd"/>
           </w:p>
         </w:tc>
       </w:tr>
@@ -6704,23 +8609,55 @@
               <w:t>Yeni</w:t>
             </w:r>
             <w:r>
-              <w:t xml:space="preserve">: Rozet sistemi altyapısı – belirli olaylarda (ilk 10k adım, 30 gün streak) </w:t>
-            </w:r>
+              <w:t xml:space="preserve">: Rozet sistemi altyapısı – belirli olaylarda (ilk 10k adım, 30 gün </w:t>
+            </w:r>
+            <w:proofErr w:type="spellStart"/>
+            <w:r>
+              <w:t>streak</w:t>
+            </w:r>
+            <w:proofErr w:type="spellEnd"/>
+            <w:r>
+              <w:t xml:space="preserve">) </w:t>
+            </w:r>
+            <w:proofErr w:type="spellStart"/>
             <w:r>
               <w:rPr>
                 <w:rStyle w:val="SourceText"/>
               </w:rPr>
-              <w:t>check_badges()</w:t>
+              <w:t>check_</w:t>
+            </w:r>
+            <w:proofErr w:type="gramStart"/>
+            <w:r>
+              <w:rPr>
+                <w:rStyle w:val="SourceText"/>
+              </w:rPr>
+              <w:t>badges</w:t>
+            </w:r>
+            <w:proofErr w:type="spellEnd"/>
+            <w:r>
+              <w:rPr>
+                <w:rStyle w:val="SourceText"/>
+              </w:rPr>
+              <w:t>(</w:t>
+            </w:r>
+            <w:proofErr w:type="gramEnd"/>
+            <w:r>
+              <w:rPr>
+                <w:rStyle w:val="SourceText"/>
+              </w:rPr>
+              <w:t>)</w:t>
             </w:r>
             <w:r>
               <w:t xml:space="preserve"> tetiklenir, </w:t>
             </w:r>
+            <w:proofErr w:type="spellStart"/>
             <w:r>
               <w:rPr>
                 <w:rStyle w:val="SourceText"/>
               </w:rPr>
               <w:t>user_badges</w:t>
             </w:r>
+            <w:proofErr w:type="spellEnd"/>
             <w:r>
               <w:t xml:space="preserve"> tablosuna eklenir</w:t>
             </w:r>
@@ -6741,9 +8678,11 @@
             <w:pPr>
               <w:pStyle w:val="TableContents"/>
             </w:pPr>
+            <w:proofErr w:type="spellStart"/>
             <w:r>
               <w:t>Backend</w:t>
             </w:r>
+            <w:proofErr w:type="spellEnd"/>
           </w:p>
         </w:tc>
       </w:tr>
@@ -6784,8 +8723,13 @@
               <w:pStyle w:val="TableContents"/>
             </w:pPr>
             <w:r>
-              <w:t>Rozet listesi ve kazanılan rozetler için endpoint</w:t>
-            </w:r>
+              <w:t xml:space="preserve">Rozet listesi ve kazanılan rozetler için </w:t>
+            </w:r>
+            <w:proofErr w:type="spellStart"/>
+            <w:r>
+              <w:t>endpoint</w:t>
+            </w:r>
+            <w:proofErr w:type="spellEnd"/>
           </w:p>
         </w:tc>
         <w:tc>
@@ -6803,9 +8747,11 @@
             <w:pPr>
               <w:pStyle w:val="TableContents"/>
             </w:pPr>
+            <w:proofErr w:type="spellStart"/>
             <w:r>
               <w:t>Backend</w:t>
             </w:r>
+            <w:proofErr w:type="spellEnd"/>
           </w:p>
         </w:tc>
       </w:tr>
@@ -6852,7 +8798,15 @@
               <w:t>Yeni</w:t>
             </w:r>
             <w:r>
-              <w:t>: Arkadaşlık yönetimi endpoint'leri (ekle, sil, listele)</w:t>
+              <w:t xml:space="preserve">: Arkadaşlık yönetimi </w:t>
+            </w:r>
+            <w:proofErr w:type="spellStart"/>
+            <w:r>
+              <w:t>endpoint'leri</w:t>
+            </w:r>
+            <w:proofErr w:type="spellEnd"/>
+            <w:r>
+              <w:t xml:space="preserve"> (ekle, sil, listele)</w:t>
             </w:r>
           </w:p>
         </w:tc>
@@ -6871,9 +8825,11 @@
             <w:pPr>
               <w:pStyle w:val="TableContents"/>
             </w:pPr>
+            <w:proofErr w:type="spellStart"/>
             <w:r>
               <w:t>Backend</w:t>
             </w:r>
+            <w:proofErr w:type="spellEnd"/>
           </w:p>
         </w:tc>
       </w:tr>
@@ -6920,13 +8876,49 @@
               <w:t>Yeni</w:t>
             </w:r>
             <w:r>
-              <w:t>: Arkadaş karşılaştırma endpoint'i (</w:t>
+              <w:t xml:space="preserve">: Arkadaş karşılaştırma </w:t>
+            </w:r>
+            <w:proofErr w:type="spellStart"/>
+            <w:r>
+              <w:t>endpoint'i</w:t>
+            </w:r>
+            <w:proofErr w:type="spellEnd"/>
+            <w:r>
+              <w:t xml:space="preserve"> (</w:t>
             </w:r>
             <w:r>
               <w:rPr>
                 <w:rStyle w:val="SourceText"/>
               </w:rPr>
-              <w:t>GET /friends/compare?friend_id=...</w:t>
+              <w:t>GET /</w:t>
+            </w:r>
+            <w:proofErr w:type="spellStart"/>
+            <w:r>
+              <w:rPr>
+                <w:rStyle w:val="SourceText"/>
+              </w:rPr>
+              <w:t>friends</w:t>
+            </w:r>
+            <w:proofErr w:type="spellEnd"/>
+            <w:r>
+              <w:rPr>
+                <w:rStyle w:val="SourceText"/>
+              </w:rPr>
+              <w:t>/</w:t>
+            </w:r>
+            <w:proofErr w:type="spellStart"/>
+            <w:r>
+              <w:rPr>
+                <w:rStyle w:val="SourceText"/>
+              </w:rPr>
+              <w:t>compare?friend_id</w:t>
+            </w:r>
+            <w:proofErr w:type="spellEnd"/>
+            <w:r>
+              <w:rPr>
+                <w:rStyle w:val="SourceText"/>
+              </w:rPr>
+              <w:t>=...</w:t>
             </w:r>
             <w:r>
               <w:t xml:space="preserve"> – iki kullanıcının haftalık seçili metrik verileri)</w:t>
@@ -6948,9 +8940,11 @@
             <w:pPr>
               <w:pStyle w:val="TableContents"/>
             </w:pPr>
+            <w:proofErr w:type="spellStart"/>
             <w:r>
               <w:t>Backend</w:t>
             </w:r>
+            <w:proofErr w:type="spellEnd"/>
           </w:p>
         </w:tc>
       </w:tr>
@@ -7010,9 +9004,11 @@
             <w:pPr>
               <w:pStyle w:val="TableContents"/>
             </w:pPr>
+            <w:proofErr w:type="spellStart"/>
             <w:r>
               <w:t>Android</w:t>
             </w:r>
+            <w:proofErr w:type="spellEnd"/>
           </w:p>
         </w:tc>
       </w:tr>
@@ -7072,9 +9068,11 @@
             <w:pPr>
               <w:pStyle w:val="TableContents"/>
             </w:pPr>
+            <w:proofErr w:type="spellStart"/>
             <w:r>
               <w:t>Android</w:t>
             </w:r>
+            <w:proofErr w:type="spellEnd"/>
           </w:p>
         </w:tc>
       </w:tr>
@@ -7141,9 +9139,11 @@
             <w:pPr>
               <w:pStyle w:val="TableContents"/>
             </w:pPr>
+            <w:proofErr w:type="spellStart"/>
             <w:r>
               <w:t>Android</w:t>
             </w:r>
+            <w:proofErr w:type="spellEnd"/>
           </w:p>
         </w:tc>
       </w:tr>
@@ -7209,9 +9209,11 @@
             <w:pPr>
               <w:pStyle w:val="TableContents"/>
             </w:pPr>
+            <w:proofErr w:type="spellStart"/>
             <w:r>
               <w:t>Android</w:t>
             </w:r>
+            <w:proofErr w:type="spellEnd"/>
           </w:p>
         </w:tc>
       </w:tr>
@@ -7277,9 +9279,11 @@
             <w:pPr>
               <w:pStyle w:val="TableContents"/>
             </w:pPr>
+            <w:proofErr w:type="spellStart"/>
             <w:r>
               <w:t>Android</w:t>
             </w:r>
+            <w:proofErr w:type="spellEnd"/>
           </w:p>
         </w:tc>
       </w:tr>
@@ -7414,7 +9418,15 @@
               <w:pStyle w:val="TableContents"/>
             </w:pPr>
             <w:r>
-              <w:t>Hassas veri şifreleme (AES-256, cryptography kütüphanesi)</w:t>
+              <w:t xml:space="preserve">Hassas veri şifreleme (AES-256, </w:t>
+            </w:r>
+            <w:proofErr w:type="spellStart"/>
+            <w:r>
+              <w:t>cryptography</w:t>
+            </w:r>
+            <w:proofErr w:type="spellEnd"/>
+            <w:r>
+              <w:t xml:space="preserve"> kütüphanesi)</w:t>
             </w:r>
           </w:p>
         </w:tc>
@@ -7433,9 +9445,11 @@
             <w:pPr>
               <w:pStyle w:val="TableContents"/>
             </w:pPr>
+            <w:proofErr w:type="spellStart"/>
             <w:r>
               <w:t>Backend</w:t>
             </w:r>
+            <w:proofErr w:type="spellEnd"/>
           </w:p>
         </w:tc>
       </w:tr>
@@ -7476,7 +9490,15 @@
               <w:pStyle w:val="TableContents"/>
             </w:pPr>
             <w:r>
-              <w:t>API güvenlik middleware'leri (CORS, rate limit)</w:t>
+              <w:t xml:space="preserve">API güvenlik </w:t>
+            </w:r>
+            <w:proofErr w:type="spellStart"/>
+            <w:r>
+              <w:t>middleware'leri</w:t>
+            </w:r>
+            <w:proofErr w:type="spellEnd"/>
+            <w:r>
+              <w:t xml:space="preserve"> (CORS, rate limit)</w:t>
             </w:r>
           </w:p>
         </w:tc>
@@ -7495,9 +9517,11 @@
             <w:pPr>
               <w:pStyle w:val="TableContents"/>
             </w:pPr>
+            <w:proofErr w:type="spellStart"/>
             <w:r>
               <w:t>Backend</w:t>
             </w:r>
+            <w:proofErr w:type="spellEnd"/>
           </w:p>
         </w:tc>
       </w:tr>
@@ -7557,9 +9581,11 @@
             <w:pPr>
               <w:pStyle w:val="TableContents"/>
             </w:pPr>
+            <w:proofErr w:type="spellStart"/>
             <w:r>
               <w:t>Backend</w:t>
             </w:r>
+            <w:proofErr w:type="spellEnd"/>
           </w:p>
         </w:tc>
       </w:tr>
@@ -7599,8 +9625,13 @@
             <w:pPr>
               <w:pStyle w:val="TableContents"/>
             </w:pPr>
-            <w:r>
-              <w:t>Loglama politikası ve uygulaması</w:t>
+            <w:proofErr w:type="spellStart"/>
+            <w:r>
+              <w:t>Loglama</w:t>
+            </w:r>
+            <w:proofErr w:type="spellEnd"/>
+            <w:r>
+              <w:t xml:space="preserve"> politikası ve uygulaması</w:t>
             </w:r>
           </w:p>
         </w:tc>
@@ -7619,9 +9650,11 @@
             <w:pPr>
               <w:pStyle w:val="TableContents"/>
             </w:pPr>
+            <w:proofErr w:type="spellStart"/>
             <w:r>
               <w:t>Veritabanı</w:t>
             </w:r>
+            <w:proofErr w:type="spellEnd"/>
           </w:p>
         </w:tc>
       </w:tr>
@@ -7681,9 +9714,11 @@
             <w:pPr>
               <w:pStyle w:val="TableContents"/>
             </w:pPr>
+            <w:proofErr w:type="spellStart"/>
             <w:r>
               <w:t>Backend</w:t>
             </w:r>
+            <w:proofErr w:type="spellEnd"/>
           </w:p>
         </w:tc>
       </w:tr>
@@ -7743,9 +9778,11 @@
             <w:pPr>
               <w:pStyle w:val="TableContents"/>
             </w:pPr>
+            <w:proofErr w:type="spellStart"/>
             <w:r>
               <w:t>Veritabanı</w:t>
             </w:r>
+            <w:proofErr w:type="spellEnd"/>
           </w:p>
         </w:tc>
       </w:tr>
@@ -7786,8 +9823,13 @@
               <w:pStyle w:val="TableContents"/>
             </w:pPr>
             <w:r>
-              <w:t>Kullanıcı veri indirme ve hesap silme arayüzü</w:t>
-            </w:r>
+              <w:t xml:space="preserve">Kullanıcı veri indirme ve hesap silme </w:t>
+            </w:r>
+            <w:proofErr w:type="spellStart"/>
+            <w:r>
+              <w:t>arayüzü</w:t>
+            </w:r>
+            <w:proofErr w:type="spellEnd"/>
           </w:p>
         </w:tc>
         <w:tc>
@@ -7805,9 +9847,11 @@
             <w:pPr>
               <w:pStyle w:val="TableContents"/>
             </w:pPr>
+            <w:proofErr w:type="spellStart"/>
             <w:r>
               <w:t>Android</w:t>
             </w:r>
+            <w:proofErr w:type="spellEnd"/>
           </w:p>
         </w:tc>
       </w:tr>
@@ -7941,8 +9985,37 @@
             <w:pPr>
               <w:pStyle w:val="TableContents"/>
             </w:pPr>
-            <w:r>
-              <w:t>Backend birim testleri (pytest, FastAPI TestClient)</w:t>
+            <w:proofErr w:type="spellStart"/>
+            <w:r>
+              <w:t>Backend</w:t>
+            </w:r>
+            <w:proofErr w:type="spellEnd"/>
+            <w:r>
+              <w:t xml:space="preserve"> birim testleri (</w:t>
+            </w:r>
+            <w:proofErr w:type="spellStart"/>
+            <w:r>
+              <w:t>pytest</w:t>
+            </w:r>
+            <w:proofErr w:type="spellEnd"/>
+            <w:r>
+              <w:t xml:space="preserve">, </w:t>
+            </w:r>
+            <w:proofErr w:type="spellStart"/>
+            <w:r>
+              <w:t>FastAPI</w:t>
+            </w:r>
+            <w:proofErr w:type="spellEnd"/>
+            <w:r>
+              <w:t xml:space="preserve"> </w:t>
+            </w:r>
+            <w:proofErr w:type="spellStart"/>
+            <w:r>
+              <w:t>TestClient</w:t>
+            </w:r>
+            <w:proofErr w:type="spellEnd"/>
+            <w:r>
+              <w:t>)</w:t>
             </w:r>
           </w:p>
         </w:tc>
@@ -7961,9 +10034,11 @@
             <w:pPr>
               <w:pStyle w:val="TableContents"/>
             </w:pPr>
+            <w:proofErr w:type="spellStart"/>
             <w:r>
               <w:t>Backend</w:t>
             </w:r>
+            <w:proofErr w:type="spellEnd"/>
           </w:p>
         </w:tc>
       </w:tr>
@@ -8023,9 +10098,11 @@
             <w:pPr>
               <w:pStyle w:val="TableContents"/>
             </w:pPr>
+            <w:proofErr w:type="spellStart"/>
             <w:r>
               <w:t>Backend</w:t>
             </w:r>
+            <w:proofErr w:type="spellEnd"/>
           </w:p>
         </w:tc>
       </w:tr>
@@ -8065,8 +10142,13 @@
             <w:pPr>
               <w:pStyle w:val="TableContents"/>
             </w:pPr>
-            <w:r>
-              <w:t>Veritabanı sorgu performans testleri</w:t>
+            <w:proofErr w:type="spellStart"/>
+            <w:r>
+              <w:t>Veritabanı</w:t>
+            </w:r>
+            <w:proofErr w:type="spellEnd"/>
+            <w:r>
+              <w:t xml:space="preserve"> sorgu performans testleri</w:t>
             </w:r>
           </w:p>
         </w:tc>
@@ -8085,9 +10167,11 @@
             <w:pPr>
               <w:pStyle w:val="TableContents"/>
             </w:pPr>
+            <w:proofErr w:type="spellStart"/>
             <w:r>
               <w:t>Veritabanı</w:t>
             </w:r>
+            <w:proofErr w:type="spellEnd"/>
           </w:p>
         </w:tc>
       </w:tr>
@@ -8127,8 +10211,13 @@
             <w:pPr>
               <w:pStyle w:val="TableContents"/>
             </w:pPr>
-            <w:r>
-              <w:t>WebSocket ve yük testi</w:t>
+            <w:proofErr w:type="spellStart"/>
+            <w:r>
+              <w:t>WebSocket</w:t>
+            </w:r>
+            <w:proofErr w:type="spellEnd"/>
+            <w:r>
+              <w:t xml:space="preserve"> ve yük testi</w:t>
             </w:r>
           </w:p>
         </w:tc>
@@ -8147,9 +10236,11 @@
             <w:pPr>
               <w:pStyle w:val="TableContents"/>
             </w:pPr>
+            <w:proofErr w:type="spellStart"/>
             <w:r>
               <w:t>Veritabanı</w:t>
             </w:r>
+            <w:proofErr w:type="spellEnd"/>
           </w:p>
         </w:tc>
       </w:tr>
@@ -8189,8 +10280,37 @@
             <w:pPr>
               <w:pStyle w:val="TableContents"/>
             </w:pPr>
-            <w:r>
-              <w:t>Android birim ve UI testleri (JUnit, Compose testing)</w:t>
+            <w:proofErr w:type="spellStart"/>
+            <w:r>
+              <w:t>Android</w:t>
+            </w:r>
+            <w:proofErr w:type="spellEnd"/>
+            <w:r>
+              <w:t xml:space="preserve"> birim ve UI testleri (</w:t>
+            </w:r>
+            <w:proofErr w:type="spellStart"/>
+            <w:r>
+              <w:t>JUnit</w:t>
+            </w:r>
+            <w:proofErr w:type="spellEnd"/>
+            <w:r>
+              <w:t xml:space="preserve">, </w:t>
+            </w:r>
+            <w:proofErr w:type="spellStart"/>
+            <w:r>
+              <w:t>Compose</w:t>
+            </w:r>
+            <w:proofErr w:type="spellEnd"/>
+            <w:r>
+              <w:t xml:space="preserve"> </w:t>
+            </w:r>
+            <w:proofErr w:type="spellStart"/>
+            <w:r>
+              <w:t>testing</w:t>
+            </w:r>
+            <w:proofErr w:type="spellEnd"/>
+            <w:r>
+              <w:t>)</w:t>
             </w:r>
           </w:p>
         </w:tc>
@@ -8209,9 +10329,11 @@
             <w:pPr>
               <w:pStyle w:val="TableContents"/>
             </w:pPr>
+            <w:proofErr w:type="spellStart"/>
             <w:r>
               <w:t>Android</w:t>
             </w:r>
+            <w:proofErr w:type="spellEnd"/>
           </w:p>
         </w:tc>
       </w:tr>
@@ -8252,7 +10374,15 @@
               <w:pStyle w:val="TableContents"/>
             </w:pPr>
             <w:r>
-              <w:t>Uçtan uca testler (manuel/scenario)</w:t>
+              <w:t>Uçtan uca testler (manuel/</w:t>
+            </w:r>
+            <w:proofErr w:type="spellStart"/>
+            <w:r>
+              <w:t>scenario</w:t>
+            </w:r>
+            <w:proofErr w:type="spellEnd"/>
+            <w:r>
+              <w:t>)</w:t>
             </w:r>
           </w:p>
         </w:tc>
@@ -8314,7 +10444,15 @@
               <w:pStyle w:val="TableContents"/>
             </w:pPr>
             <w:r>
-              <w:t>Hata izleme (Sentry entegrasyonu)</w:t>
+              <w:t>Hata izleme (</w:t>
+            </w:r>
+            <w:proofErr w:type="spellStart"/>
+            <w:r>
+              <w:t>Sentry</w:t>
+            </w:r>
+            <w:proofErr w:type="spellEnd"/>
+            <w:r>
+              <w:t xml:space="preserve"> entegrasyonu)</w:t>
             </w:r>
           </w:p>
         </w:tc>
@@ -8333,9 +10471,19 @@
             <w:pPr>
               <w:pStyle w:val="TableContents"/>
             </w:pPr>
-            <w:r>
-              <w:t>Backend/Veritabanı</w:t>
-            </w:r>
+            <w:proofErr w:type="spellStart"/>
+            <w:r>
+              <w:t>Backend</w:t>
+            </w:r>
+            <w:proofErr w:type="spellEnd"/>
+            <w:r>
+              <w:t>/</w:t>
+            </w:r>
+            <w:proofErr w:type="spellStart"/>
+            <w:r>
+              <w:t>Veritabanı</w:t>
+            </w:r>
+            <w:proofErr w:type="spellEnd"/>
           </w:p>
         </w:tc>
       </w:tr>
@@ -8469,9 +10617,24 @@
             <w:pPr>
               <w:pStyle w:val="TableContents"/>
             </w:pPr>
-            <w:r>
-              <w:t>Dockerfile ve docker-compose.prod</w:t>
-            </w:r>
+            <w:proofErr w:type="spellStart"/>
+            <w:r>
+              <w:t>Dockerfile</w:t>
+            </w:r>
+            <w:proofErr w:type="spellEnd"/>
+            <w:r>
+              <w:t xml:space="preserve"> ve </w:t>
+            </w:r>
+            <w:proofErr w:type="spellStart"/>
+            <w:r>
+              <w:t>docker-</w:t>
+            </w:r>
+            <w:proofErr w:type="gramStart"/>
+            <w:r>
+              <w:t>compose.prod</w:t>
+            </w:r>
+            <w:proofErr w:type="spellEnd"/>
+            <w:proofErr w:type="gramEnd"/>
           </w:p>
         </w:tc>
         <w:tc>
@@ -8489,9 +10652,11 @@
             <w:pPr>
               <w:pStyle w:val="TableContents"/>
             </w:pPr>
+            <w:proofErr w:type="spellStart"/>
             <w:r>
               <w:t>Veritabanı</w:t>
             </w:r>
+            <w:proofErr w:type="spellEnd"/>
           </w:p>
         </w:tc>
       </w:tr>
@@ -8532,7 +10697,23 @@
               <w:pStyle w:val="TableContents"/>
             </w:pPr>
             <w:r>
-              <w:t>CI/CD (GitHub Actions)</w:t>
+              <w:t>CI/CD (</w:t>
+            </w:r>
+            <w:proofErr w:type="spellStart"/>
+            <w:r>
+              <w:t>GitHub</w:t>
+            </w:r>
+            <w:proofErr w:type="spellEnd"/>
+            <w:r>
+              <w:t xml:space="preserve"> </w:t>
+            </w:r>
+            <w:proofErr w:type="spellStart"/>
+            <w:r>
+              <w:t>Actions</w:t>
+            </w:r>
+            <w:proofErr w:type="spellEnd"/>
+            <w:r>
+              <w:t>)</w:t>
             </w:r>
           </w:p>
         </w:tc>
@@ -8551,9 +10732,11 @@
             <w:pPr>
               <w:pStyle w:val="TableContents"/>
             </w:pPr>
+            <w:proofErr w:type="spellStart"/>
             <w:r>
               <w:t>Veritabanı</w:t>
             </w:r>
+            <w:proofErr w:type="spellEnd"/>
           </w:p>
         </w:tc>
       </w:tr>
@@ -8593,8 +10776,29 @@
             <w:pPr>
               <w:pStyle w:val="TableContents"/>
             </w:pPr>
-            <w:r>
-              <w:t>Android release build ve mağaza dağıtımı</w:t>
+            <w:proofErr w:type="spellStart"/>
+            <w:r>
+              <w:t>Android</w:t>
+            </w:r>
+            <w:proofErr w:type="spellEnd"/>
+            <w:r>
+              <w:t xml:space="preserve"> </w:t>
+            </w:r>
+            <w:proofErr w:type="spellStart"/>
+            <w:r>
+              <w:t>release</w:t>
+            </w:r>
+            <w:proofErr w:type="spellEnd"/>
+            <w:r>
+              <w:t xml:space="preserve"> </w:t>
+            </w:r>
+            <w:proofErr w:type="spellStart"/>
+            <w:r>
+              <w:t>build</w:t>
+            </w:r>
+            <w:proofErr w:type="spellEnd"/>
+            <w:r>
+              <w:t xml:space="preserve"> ve mağaza dağıtımı</w:t>
             </w:r>
           </w:p>
         </w:tc>
@@ -8613,9 +10817,11 @@
             <w:pPr>
               <w:pStyle w:val="TableContents"/>
             </w:pPr>
+            <w:proofErr w:type="spellStart"/>
             <w:r>
               <w:t>Android</w:t>
             </w:r>
+            <w:proofErr w:type="spellEnd"/>
           </w:p>
         </w:tc>
       </w:tr>
@@ -8655,8 +10861,21 @@
             <w:pPr>
               <w:pStyle w:val="TableContents"/>
             </w:pPr>
-            <w:r>
-              <w:t>Backend deployment (sunucu, SSL)</w:t>
+            <w:proofErr w:type="spellStart"/>
+            <w:r>
+              <w:t>Backend</w:t>
+            </w:r>
+            <w:proofErr w:type="spellEnd"/>
+            <w:r>
+              <w:t xml:space="preserve"> </w:t>
+            </w:r>
+            <w:proofErr w:type="spellStart"/>
+            <w:r>
+              <w:t>deployment</w:t>
+            </w:r>
+            <w:proofErr w:type="spellEnd"/>
+            <w:r>
+              <w:t xml:space="preserve"> (sunucu, SSL)</w:t>
             </w:r>
           </w:p>
         </w:tc>
@@ -8675,9 +10894,11 @@
             <w:pPr>
               <w:pStyle w:val="TableContents"/>
             </w:pPr>
+            <w:proofErr w:type="spellStart"/>
             <w:r>
               <w:t>Backend</w:t>
             </w:r>
+            <w:proofErr w:type="spellEnd"/>
           </w:p>
         </w:tc>
       </w:tr>
@@ -8737,9 +10958,11 @@
             <w:pPr>
               <w:pStyle w:val="TableContents"/>
             </w:pPr>
+            <w:proofErr w:type="spellStart"/>
             <w:r>
               <w:t>Veritabanı</w:t>
             </w:r>
+            <w:proofErr w:type="spellEnd"/>
           </w:p>
         </w:tc>
       </w:tr>
@@ -8955,8 +11178,45 @@
             <w:pPr>
               <w:pStyle w:val="TableContents"/>
             </w:pPr>
-            <w:r>
-              <w:t>Backend (Celery task), Android (Foreground Service kontrolü)</w:t>
+            <w:proofErr w:type="spellStart"/>
+            <w:r>
+              <w:t>Backend</w:t>
+            </w:r>
+            <w:proofErr w:type="spellEnd"/>
+            <w:r>
+              <w:t xml:space="preserve"> (</w:t>
+            </w:r>
+            <w:proofErr w:type="spellStart"/>
+            <w:r>
+              <w:t>Celery</w:t>
+            </w:r>
+            <w:proofErr w:type="spellEnd"/>
+            <w:r>
+              <w:t xml:space="preserve"> </w:t>
+            </w:r>
+            <w:proofErr w:type="spellStart"/>
+            <w:r>
+              <w:t>task</w:t>
+            </w:r>
+            <w:proofErr w:type="spellEnd"/>
+            <w:r>
+              <w:t xml:space="preserve">), </w:t>
+            </w:r>
+            <w:proofErr w:type="spellStart"/>
+            <w:r>
+              <w:t>Android</w:t>
+            </w:r>
+            <w:proofErr w:type="spellEnd"/>
+            <w:r>
+              <w:t xml:space="preserve"> (</w:t>
+            </w:r>
+            <w:proofErr w:type="spellStart"/>
+            <w:r>
+              <w:t>Foreground</w:t>
+            </w:r>
+            <w:proofErr w:type="spellEnd"/>
+            <w:r>
+              <w:t xml:space="preserve"> Service kontrolü)</w:t>
             </w:r>
           </w:p>
         </w:tc>
@@ -8978,7 +11238,15 @@
               <w:pStyle w:val="TableContents"/>
             </w:pPr>
             <w:r>
-              <w:t>Sağlık raporu export (PDF/CSV)</w:t>
+              <w:t xml:space="preserve">Sağlık raporu </w:t>
+            </w:r>
+            <w:proofErr w:type="spellStart"/>
+            <w:r>
+              <w:t>export</w:t>
+            </w:r>
+            <w:proofErr w:type="spellEnd"/>
+            <w:r>
+              <w:t xml:space="preserve"> (PDF/CSV)</w:t>
             </w:r>
           </w:p>
         </w:tc>
@@ -9017,8 +11285,29 @@
             <w:pPr>
               <w:pStyle w:val="TableContents"/>
             </w:pPr>
-            <w:r>
-              <w:t>Backend (rapor üretimi), Android (indirme arayüzü)</w:t>
+            <w:proofErr w:type="spellStart"/>
+            <w:r>
+              <w:t>Backend</w:t>
+            </w:r>
+            <w:proofErr w:type="spellEnd"/>
+            <w:r>
+              <w:t xml:space="preserve"> (rapor üretimi), </w:t>
+            </w:r>
+            <w:proofErr w:type="spellStart"/>
+            <w:r>
+              <w:t>Android</w:t>
+            </w:r>
+            <w:proofErr w:type="spellEnd"/>
+            <w:r>
+              <w:t xml:space="preserve"> (indirme </w:t>
+            </w:r>
+            <w:proofErr w:type="spellStart"/>
+            <w:r>
+              <w:t>arayüzü</w:t>
+            </w:r>
+            <w:proofErr w:type="spellEnd"/>
+            <w:r>
+              <w:t>)</w:t>
             </w:r>
           </w:p>
         </w:tc>
@@ -9080,8 +11369,45 @@
             <w:pPr>
               <w:pStyle w:val="TableContents"/>
             </w:pPr>
-            <w:r>
-              <w:t>Backend (arkadaşlık ve karşılaştırma API), Veritabanı (friendships tablosu), Android (arayüz)</w:t>
+            <w:proofErr w:type="spellStart"/>
+            <w:r>
+              <w:t>Backend</w:t>
+            </w:r>
+            <w:proofErr w:type="spellEnd"/>
+            <w:r>
+              <w:t xml:space="preserve"> (arkadaşlık ve karşılaştırma API), </w:t>
+            </w:r>
+            <w:proofErr w:type="spellStart"/>
+            <w:r>
+              <w:t>Veritabanı</w:t>
+            </w:r>
+            <w:proofErr w:type="spellEnd"/>
+            <w:r>
+              <w:t xml:space="preserve"> (</w:t>
+            </w:r>
+            <w:proofErr w:type="spellStart"/>
+            <w:r>
+              <w:t>friendships</w:t>
+            </w:r>
+            <w:proofErr w:type="spellEnd"/>
+            <w:r>
+              <w:t xml:space="preserve"> tablosu), </w:t>
+            </w:r>
+            <w:proofErr w:type="spellStart"/>
+            <w:r>
+              <w:t>Android</w:t>
+            </w:r>
+            <w:proofErr w:type="spellEnd"/>
+            <w:r>
+              <w:t xml:space="preserve"> (</w:t>
+            </w:r>
+            <w:proofErr w:type="spellStart"/>
+            <w:r>
+              <w:t>arayüz</w:t>
+            </w:r>
+            <w:proofErr w:type="spellEnd"/>
+            <w:r>
+              <w:t>)</w:t>
             </w:r>
           </w:p>
         </w:tc>
@@ -9142,8 +11468,45 @@
             <w:pPr>
               <w:pStyle w:val="TableContents"/>
             </w:pPr>
-            <w:r>
-              <w:t>Backend (rozet motoru), Veritabanı (badges, user_badges), Android (koleksiyon ekranı)</w:t>
+            <w:proofErr w:type="spellStart"/>
+            <w:r>
+              <w:t>Backend</w:t>
+            </w:r>
+            <w:proofErr w:type="spellEnd"/>
+            <w:r>
+              <w:t xml:space="preserve"> (rozet motoru), </w:t>
+            </w:r>
+            <w:proofErr w:type="spellStart"/>
+            <w:r>
+              <w:t>Veritabanı</w:t>
+            </w:r>
+            <w:proofErr w:type="spellEnd"/>
+            <w:r>
+              <w:t xml:space="preserve"> (</w:t>
+            </w:r>
+            <w:proofErr w:type="spellStart"/>
+            <w:r>
+              <w:t>badges</w:t>
+            </w:r>
+            <w:proofErr w:type="spellEnd"/>
+            <w:r>
+              <w:t xml:space="preserve">, </w:t>
+            </w:r>
+            <w:proofErr w:type="spellStart"/>
+            <w:r>
+              <w:t>user_badges</w:t>
+            </w:r>
+            <w:proofErr w:type="spellEnd"/>
+            <w:r>
+              <w:t xml:space="preserve">), </w:t>
+            </w:r>
+            <w:proofErr w:type="spellStart"/>
+            <w:r>
+              <w:t>Android</w:t>
+            </w:r>
+            <w:proofErr w:type="spellEnd"/>
+            <w:r>
+              <w:t xml:space="preserve"> (koleksiyon ekranı)</w:t>
             </w:r>
           </w:p>
         </w:tc>
@@ -9164,8 +11527,13 @@
             <w:pPr>
               <w:pStyle w:val="TableContents"/>
             </w:pPr>
-            <w:r>
-              <w:t>Paycell ödeme geçmişi ve abonelik yönetimi</w:t>
+            <w:proofErr w:type="spellStart"/>
+            <w:r>
+              <w:t>Paycell</w:t>
+            </w:r>
+            <w:proofErr w:type="spellEnd"/>
+            <w:r>
+              <w:t xml:space="preserve"> ödeme geçmişi ve abonelik yönetimi</w:t>
             </w:r>
           </w:p>
         </w:tc>
@@ -9204,8 +11572,45 @@
             <w:pPr>
               <w:pStyle w:val="TableContents"/>
             </w:pPr>
-            <w:r>
-              <w:t>Backend (endpoint'ler), Veritabanı (payment_history), Android (ekran)</w:t>
+            <w:proofErr w:type="spellStart"/>
+            <w:r>
+              <w:t>Backend</w:t>
+            </w:r>
+            <w:proofErr w:type="spellEnd"/>
+            <w:r>
+              <w:t xml:space="preserve"> (</w:t>
+            </w:r>
+            <w:proofErr w:type="spellStart"/>
+            <w:r>
+              <w:t>endpoint'ler</w:t>
+            </w:r>
+            <w:proofErr w:type="spellEnd"/>
+            <w:r>
+              <w:t xml:space="preserve">), </w:t>
+            </w:r>
+            <w:proofErr w:type="spellStart"/>
+            <w:r>
+              <w:t>Veritabanı</w:t>
+            </w:r>
+            <w:proofErr w:type="spellEnd"/>
+            <w:r>
+              <w:t xml:space="preserve"> (</w:t>
+            </w:r>
+            <w:proofErr w:type="spellStart"/>
+            <w:r>
+              <w:t>payment_history</w:t>
+            </w:r>
+            <w:proofErr w:type="spellEnd"/>
+            <w:r>
+              <w:t xml:space="preserve">), </w:t>
+            </w:r>
+            <w:proofErr w:type="spellStart"/>
+            <w:r>
+              <w:t>Android</w:t>
+            </w:r>
+            <w:proofErr w:type="spellEnd"/>
+            <w:r>
+              <w:t xml:space="preserve"> (ekran)</w:t>
             </w:r>
           </w:p>
         </w:tc>

</xml_diff>